<commit_message>
Match the build plan to this project's actual assets
The plan assumed Starter Content, which this project was created
without. Updated to use what the Top Down template already ships:

- SM_Cylinder from Content/LevelPrototyping/Meshes as the character
  placeholder, in place of Shape_Cylinder
- MI_PrototypeGrid_Gray / MI_DefaultColorway for level materials
- Step 1.1 no longer asks for Starter Content at all

Renames the input mapping context to IMC_Gunsmoke, because the template
already ships an IMC_Default at Content/TopDown/Input/ that would clash,
with a note explaining why and warning off the template's other BP_TopDown*
assets.

Co-Authored-By: Claude Opus 5 <noreply@anthropic.com>
</commit_message>
<xml_diff>
--- a/Docs/Gunsmoke Mines - 2-Day Build Plan.docx
+++ b/Docs/Gunsmoke Mines - 2-Day Build Plan.docx
@@ -2205,7 +2205,7 @@
         <w:spacing w:after="90" w:line="276"/>
       </w:pPr>
       <w:r>
-        <w:t xml:space="preserve">Set Blueprint (not C++), Desktop, Scalable, Starter Content ON. Name it GunsmokeMines. Create.</w:t>
+        <w:t xml:space="preserve">Set Blueprint (not C++), Desktop, Scalable. Starter Content is not needed — the Top Down template already ships the placeholder meshes and materials this plan uses. Name the project and click Create.</w:t>
       </w:r>
     </w:p>
     <w:tbl>
@@ -2854,7 +2854,7 @@
         <w:spacing w:after="140" w:line="276"/>
       </w:pPr>
       <w:r>
-        <w:t xml:space="preserve">Then right-click → Input → Input Mapping Context, name it IMC_Default, and add all three. IA_Move needs four key bindings with modifiers, which is what turns four separate keys into one movement direction:</w:t>
+        <w:t xml:space="preserve">Then right-click → Input → Input Mapping Context, name it IMC_Gunsmoke, and add all three. IA_Move needs four key bindings with modifiers, which is what turns four separate keys into one movement direction:</w:t>
       </w:r>
     </w:p>
     <w:tbl>
@@ -3293,118 +3293,6 @@
         </w:tc>
       </w:tr>
     </w:tbl>
-    <w:p>
-      <w:pPr>
-        <w:pStyle w:val="Heading2"/>
-      </w:pPr>
-      <w:r>
-        <w:t xml:space="preserve">1.4 Make the player</w:t>
-      </w:r>
-    </w:p>
-    <w:p>
-      <w:pPr>
-        <w:pStyle w:val="ListParagraph"/>
-        <w:numPr>
-          <w:ilvl w:val="0"/>
-          <w:numId w:val="4"/>
-        </w:numPr>
-        <w:spacing w:after="90" w:line="276"/>
-      </w:pPr>
-      <w:r>
-        <w:t xml:space="preserve">Right-click in the Content Browser → Blueprint Class → Character. Name it BP_Player.</w:t>
-      </w:r>
-    </w:p>
-    <w:p>
-      <w:pPr>
-        <w:pStyle w:val="ListParagraph"/>
-        <w:numPr>
-          <w:ilvl w:val="0"/>
-          <w:numId w:val="4"/>
-        </w:numPr>
-        <w:spacing w:after="90" w:line="276"/>
-      </w:pPr>
-      <w:r>
-        <w:t xml:space="preserve">Select the Capsule Component: Radius 34, Half Height 88.</w:t>
-      </w:r>
-    </w:p>
-    <w:p>
-      <w:pPr>
-        <w:pStyle w:val="ListParagraph"/>
-        <w:numPr>
-          <w:ilvl w:val="0"/>
-          <w:numId w:val="4"/>
-        </w:numPr>
-        <w:spacing w:after="90" w:line="276"/>
-      </w:pPr>
-      <w:r>
-        <w:t xml:space="preserve">Add a Static Mesh component as a child of the capsule. Assign Shape_Cylinder, set its Z to -88, and set Collision Presets to NoCollision.</w:t>
-      </w:r>
-    </w:p>
-    <w:p>
-      <w:pPr>
-        <w:pStyle w:val="ListParagraph"/>
-        <w:numPr>
-          <w:ilvl w:val="0"/>
-          <w:numId w:val="4"/>
-        </w:numPr>
-        <w:spacing w:after="90" w:line="276"/>
-      </w:pPr>
-      <w:r>
-        <w:t xml:space="preserve">Add a Spring Arm: Target Arm Length 1200, Rotation Pitch -60. Untick Do Collision Test, untick Inherit Pitch, Inherit Yaw and Inherit Roll. Tick Enable Camera Lag.</w:t>
-      </w:r>
-    </w:p>
-    <w:p>
-      <w:pPr>
-        <w:pStyle w:val="ListParagraph"/>
-        <w:numPr>
-          <w:ilvl w:val="0"/>
-          <w:numId w:val="4"/>
-        </w:numPr>
-        <w:spacing w:after="90" w:line="276"/>
-      </w:pPr>
-      <w:r>
-        <w:t xml:space="preserve">Add a Camera as a child of the Spring Arm. Untick Use Pawn Control Rotation.</w:t>
-      </w:r>
-    </w:p>
-    <w:p>
-      <w:pPr>
-        <w:pStyle w:val="ListParagraph"/>
-        <w:numPr>
-          <w:ilvl w:val="0"/>
-          <w:numId w:val="4"/>
-        </w:numPr>
-        <w:spacing w:after="90" w:line="276"/>
-      </w:pPr>
-      <w:r>
-        <w:t xml:space="preserve">Click Class Defaults at the top. Untick Use Controller Rotation Pitch, Yaw and Roll — all three of them.</w:t>
-      </w:r>
-    </w:p>
-    <w:p>
-      <w:pPr>
-        <w:pStyle w:val="ListParagraph"/>
-        <w:numPr>
-          <w:ilvl w:val="0"/>
-          <w:numId w:val="4"/>
-        </w:numPr>
-        <w:spacing w:after="90" w:line="276"/>
-      </w:pPr>
-      <w:r>
-        <w:t xml:space="preserve">Select Character Movement: Max Walk Speed 500, untick Orient Rotation to Movement.</w:t>
-      </w:r>
-    </w:p>
-    <w:p>
-      <w:pPr>
-        <w:pStyle w:val="ListParagraph"/>
-        <w:numPr>
-          <w:ilvl w:val="0"/>
-          <w:numId w:val="4"/>
-        </w:numPr>
-        <w:spacing w:after="90" w:line="276"/>
-      </w:pPr>
-      <w:r>
-        <w:t xml:space="preserve">Right-click in the Content Browser → Blueprint Class → Game Mode Base, name it BP_GameMode, and set its Default Pawn Class to BP_Player. Then in the level, Window → World Settings → GameMode Override → BP_GameMode.</w:t>
-      </w:r>
-    </w:p>
     <w:tbl>
       <w:tblPr>
         <w:tblW w:type="dxa" w:w="9026"/>
@@ -3447,6 +3335,174 @@
                 <w:sz w:val="18"/>
                 <w:szCs w:val="18"/>
               </w:rPr>
+              <w:t xml:space="preserve">Why not call it IMC_Default: </w:t>
+            </w:r>
+            <w:r>
+              <w:rPr>
+                <w:color w:val="2B2B2B"/>
+                <w:sz w:val="18"/>
+                <w:szCs w:val="18"/>
+              </w:rPr>
+              <w:t xml:space="preserve">the Top Down template already ships an IMC_Default at Content/TopDown/Input/. Using IMC_Gunsmoke avoids the name clash and makes it obvious at a glance which mapping context is yours. The same goes for the template's own BP_TopDownCharacter, BP_TopDownController and BP_TopDownGameMode — leave them alone, you are building your own.</w:t>
+            </w:r>
+          </w:p>
+        </w:tc>
+      </w:tr>
+    </w:tbl>
+    <w:p>
+      <w:pPr>
+        <w:pStyle w:val="Heading2"/>
+      </w:pPr>
+      <w:r>
+        <w:t xml:space="preserve">1.4 Make the player</w:t>
+      </w:r>
+    </w:p>
+    <w:p>
+      <w:pPr>
+        <w:pStyle w:val="ListParagraph"/>
+        <w:numPr>
+          <w:ilvl w:val="0"/>
+          <w:numId w:val="4"/>
+        </w:numPr>
+        <w:spacing w:after="90" w:line="276"/>
+      </w:pPr>
+      <w:r>
+        <w:t xml:space="preserve">Right-click in the Content Browser → Blueprint Class → Character. Name it BP_Player.</w:t>
+      </w:r>
+    </w:p>
+    <w:p>
+      <w:pPr>
+        <w:pStyle w:val="ListParagraph"/>
+        <w:numPr>
+          <w:ilvl w:val="0"/>
+          <w:numId w:val="4"/>
+        </w:numPr>
+        <w:spacing w:after="90" w:line="276"/>
+      </w:pPr>
+      <w:r>
+        <w:t xml:space="preserve">Select the Capsule Component: Radius 34, Half Height 88.</w:t>
+      </w:r>
+    </w:p>
+    <w:p>
+      <w:pPr>
+        <w:pStyle w:val="ListParagraph"/>
+        <w:numPr>
+          <w:ilvl w:val="0"/>
+          <w:numId w:val="4"/>
+        </w:numPr>
+        <w:spacing w:after="90" w:line="276"/>
+      </w:pPr>
+      <w:r>
+        <w:t xml:space="preserve">Add a Static Mesh component as a child of the capsule. Assign SM_Cylinder from Content/LevelPrototyping/Meshes, set its Z to -88, and set Collision Presets to NoCollision.</w:t>
+      </w:r>
+    </w:p>
+    <w:p>
+      <w:pPr>
+        <w:pStyle w:val="ListParagraph"/>
+        <w:numPr>
+          <w:ilvl w:val="0"/>
+          <w:numId w:val="4"/>
+        </w:numPr>
+        <w:spacing w:after="90" w:line="276"/>
+      </w:pPr>
+      <w:r>
+        <w:t xml:space="preserve">Add a Spring Arm: Target Arm Length 1200, Rotation Pitch -60. Untick Do Collision Test, untick Inherit Pitch, Inherit Yaw and Inherit Roll. Tick Enable Camera Lag.</w:t>
+      </w:r>
+    </w:p>
+    <w:p>
+      <w:pPr>
+        <w:pStyle w:val="ListParagraph"/>
+        <w:numPr>
+          <w:ilvl w:val="0"/>
+          <w:numId w:val="4"/>
+        </w:numPr>
+        <w:spacing w:after="90" w:line="276"/>
+      </w:pPr>
+      <w:r>
+        <w:t xml:space="preserve">Add a Camera as a child of the Spring Arm. Untick Use Pawn Control Rotation.</w:t>
+      </w:r>
+    </w:p>
+    <w:p>
+      <w:pPr>
+        <w:pStyle w:val="ListParagraph"/>
+        <w:numPr>
+          <w:ilvl w:val="0"/>
+          <w:numId w:val="4"/>
+        </w:numPr>
+        <w:spacing w:after="90" w:line="276"/>
+      </w:pPr>
+      <w:r>
+        <w:t xml:space="preserve">Click Class Defaults at the top. Untick Use Controller Rotation Pitch, Yaw and Roll — all three of them.</w:t>
+      </w:r>
+    </w:p>
+    <w:p>
+      <w:pPr>
+        <w:pStyle w:val="ListParagraph"/>
+        <w:numPr>
+          <w:ilvl w:val="0"/>
+          <w:numId w:val="4"/>
+        </w:numPr>
+        <w:spacing w:after="90" w:line="276"/>
+      </w:pPr>
+      <w:r>
+        <w:t xml:space="preserve">Select Character Movement: Max Walk Speed 500, untick Orient Rotation to Movement.</w:t>
+      </w:r>
+    </w:p>
+    <w:p>
+      <w:pPr>
+        <w:pStyle w:val="ListParagraph"/>
+        <w:numPr>
+          <w:ilvl w:val="0"/>
+          <w:numId w:val="4"/>
+        </w:numPr>
+        <w:spacing w:after="90" w:line="276"/>
+      </w:pPr>
+      <w:r>
+        <w:t xml:space="preserve">Right-click in the Content Browser → Blueprint Class → Game Mode Base, name it BP_GameMode, and set its Default Pawn Class to BP_Player. Then in the level, Window → World Settings → GameMode Override → BP_GameMode.</w:t>
+      </w:r>
+    </w:p>
+    <w:tbl>
+      <w:tblPr>
+        <w:tblW w:type="dxa" w:w="9026"/>
+        <w:tblBorders>
+          <w:top w:val="single" w:color="E2D5BE" w:sz="2"/>
+          <w:left w:val="single" w:color="B08A50" w:sz="12"/>
+          <w:bottom w:val="single" w:color="E2D5BE" w:sz="2"/>
+          <w:right w:val="single" w:color="E2D5BE" w:sz="2"/>
+          <w:insideH w:val="single" w:color="auto" w:sz="4"/>
+          <w:insideV w:val="single" w:color="auto" w:sz="4"/>
+        </w:tblBorders>
+      </w:tblPr>
+      <w:tblGrid>
+        <w:gridCol w:w="9026"/>
+      </w:tblGrid>
+      <w:tr>
+        <w:trPr>
+          <w:cantSplit/>
+        </w:trPr>
+        <w:tc>
+          <w:tcPr>
+            <w:tcW w:type="dxa" w:w="9026"/>
+            <w:shd w:fill="FBF6EC" w:color="auto" w:val="clear"/>
+            <w:tcMar>
+              <w:top w:type="dxa" w:w="80"/>
+              <w:left w:type="dxa" w:w="140"/>
+              <w:bottom w:type="dxa" w:w="80"/>
+              <w:right w:type="dxa" w:w="120"/>
+            </w:tcMar>
+          </w:tcPr>
+          <w:p>
+            <w:pPr>
+              <w:spacing w:after="0" w:line="260"/>
+            </w:pPr>
+            <w:r>
+              <w:rPr>
+                <w:b/>
+                <w:bCs/>
+                <w:color w:val="6E2A1F"/>
+                <w:sz w:val="18"/>
+                <w:szCs w:val="18"/>
+              </w:rPr>
               <w:t xml:space="preserve">Step 6 is the one people miss. </w:t>
             </w:r>
             <w:r>
@@ -3645,7 +3701,7 @@
                 <w:sz w:val="17"/>
                 <w:szCs w:val="17"/>
               </w:rPr>
-              <w:t xml:space="preserve">  → Add Mapping Context [Mapping Context = IMC_Default, Priority = 0]</w:t>
+              <w:t xml:space="preserve">  → Add Mapping Context [Mapping Context = IMC_Gunsmoke, Priority = 0]</w:t>
             </w:r>
           </w:p>
         </w:tc>
@@ -8243,7 +8299,7 @@
         <w:spacing w:after="90" w:line="276"/>
       </w:pPr>
       <w:r>
-        <w:t xml:space="preserve">Drag Starter Content rock and wood materials onto your cubes. Ten minutes, and it is the difference between grey boxes and a mine on camera.</w:t>
+        <w:t xml:space="preserve">Drag MI_PrototypeGrid_Gray or MI_DefaultColorway from Content/LevelPrototyping/Materials onto your cubes, and tint a few of them brown in the material instance. Ten minutes, and it is the difference between grey boxes and a mine on camera.</w:t>
       </w:r>
     </w:p>
     <w:p>
@@ -8653,7 +8709,7 @@
         <w:spacing w:after="140" w:line="276"/>
       </w:pPr>
       <w:r>
-        <w:t xml:space="preserve">Add an IA_Melee Input Action on Right Mouse Button, add it to IMC_Default, and add MeleeDamage (Float, 35) to BP_Player.</w:t>
+        <w:t xml:space="preserve">Add an IA_Melee Input Action on Right Mouse Button, add it to IMC_Gunsmoke, and add MeleeDamage (Float, 35) to BP_Player.</w:t>
       </w:r>
     </w:p>
     <w:tbl>
@@ -9802,7 +9858,7 @@
                 <w:sz w:val="19"/>
                 <w:szCs w:val="19"/>
               </w:rPr>
-              <w:t xml:space="preserve">IMC_Default</w:t>
+              <w:t xml:space="preserve">IMC_Gunsmoke</w:t>
             </w:r>
           </w:p>
         </w:tc>

</xml_diff>

<commit_message>
Build plan: fix fifteen problems found while building
Wrong instructions: Pawn collision ignores the Visibility channel (why
shots pass through bandits), AI MoveTo's Pawn pin needs wiring, Get Hit
Result Under Cursor is a pure node, Action Value cannot be split.

Ambiguities: which Z is -88, which box is Pitch, what "turn the controls
on" means, and a missing Content folder step.

Adds a "Five things about Blueprint that nothing tells you" section up
front covering pure vs executable nodes, dragging from pins rather than
right-clicking, where the arithmetic operators live, silent failure, and
compile-then-save.

Also: Ignore Self is a checkbox so the Make Array step was unnecessary,
Delay replaces Set Timer by Event, one Get Distance To feeds both range
checks, and bandits die in one shot not two.

Co-Authored-By: Claude Opus 5 <noreply@anthropic.com>
</commit_message>
<xml_diff>
--- a/Docs/Gunsmoke Mines - 2-Day Build Plan.docx
+++ b/Docs/Gunsmoke Mines - 2-Day Build Plan.docx
@@ -2094,6 +2094,381 @@
     </w:tbl>
     <w:p>
       <w:pPr>
+        <w:pStyle w:val="Heading2"/>
+      </w:pPr>
+      <w:r>
+        <w:t xml:space="preserve">Five things about Blueprint that nothing tells you</w:t>
+      </w:r>
+    </w:p>
+    <w:p>
+      <w:pPr>
+        <w:spacing w:after="140" w:line="276"/>
+      </w:pPr>
+      <w:r>
+        <w:t xml:space="preserve">These caused more lost time than every other problem in this build combined. Read them now; they will each save you an hour later.</w:t>
+      </w:r>
+    </w:p>
+    <w:tbl>
+      <w:tblPr>
+        <w:tblW w:type="dxa" w:w="9026"/>
+        <w:tblBorders>
+          <w:top w:val="single" w:color="auto" w:sz="4"/>
+          <w:left w:val="single" w:color="auto" w:sz="4"/>
+          <w:bottom w:val="single" w:color="auto" w:sz="4"/>
+          <w:right w:val="single" w:color="auto" w:sz="4"/>
+          <w:insideH w:val="single" w:color="auto" w:sz="4"/>
+          <w:insideV w:val="single" w:color="auto" w:sz="4"/>
+        </w:tblBorders>
+      </w:tblPr>
+      <w:tblGrid>
+        <w:gridCol w:w="2400"/>
+        <w:gridCol w:w="6626"/>
+      </w:tblGrid>
+      <w:tr>
+        <w:trPr>
+          <w:tblHeader w:val="false"/>
+        </w:trPr>
+        <w:tc>
+          <w:tcPr>
+            <w:tcW w:type="dxa" w:w="2400"/>
+            <w:tcMar>
+              <w:top w:type="dxa" w:w="60"/>
+              <w:left w:type="dxa" w:w="120"/>
+              <w:bottom w:type="dxa" w:w="60"/>
+              <w:right w:type="dxa" w:w="120"/>
+            </w:tcMar>
+          </w:tcPr>
+          <w:p>
+            <w:pPr>
+              <w:spacing w:after="0" w:line="260"/>
+            </w:pPr>
+            <w:r>
+              <w:rPr>
+                <w:b w:val="false"/>
+                <w:bCs w:val="false"/>
+                <w:color w:val="2B2B2B"/>
+                <w:sz w:val="19"/>
+                <w:szCs w:val="19"/>
+              </w:rPr>
+              <w:t xml:space="preserve"/>
+            </w:r>
+          </w:p>
+        </w:tc>
+        <w:tc>
+          <w:tcPr>
+            <w:tcW w:type="dxa" w:w="6626"/>
+            <w:tcMar>
+              <w:top w:type="dxa" w:w="60"/>
+              <w:left w:type="dxa" w:w="120"/>
+              <w:bottom w:type="dxa" w:w="60"/>
+              <w:right w:type="dxa" w:w="120"/>
+            </w:tcMar>
+          </w:tcPr>
+          <w:p>
+            <w:pPr>
+              <w:spacing w:after="0" w:line="260"/>
+            </w:pPr>
+            <w:r>
+              <w:rPr>
+                <w:b w:val="false"/>
+                <w:bCs w:val="false"/>
+                <w:color w:val="2B2B2B"/>
+                <w:sz w:val="19"/>
+                <w:szCs w:val="19"/>
+              </w:rPr>
+              <w:t xml:space="preserve"/>
+            </w:r>
+          </w:p>
+        </w:tc>
+      </w:tr>
+      <w:tr>
+        <w:trPr>
+          <w:tblHeader w:val="false"/>
+        </w:trPr>
+        <w:tc>
+          <w:tcPr>
+            <w:tcW w:type="dxa" w:w="2400"/>
+            <w:tcMar>
+              <w:top w:type="dxa" w:w="60"/>
+              <w:left w:type="dxa" w:w="120"/>
+              <w:bottom w:type="dxa" w:w="60"/>
+              <w:right w:type="dxa" w:w="120"/>
+            </w:tcMar>
+          </w:tcPr>
+          <w:p>
+            <w:pPr>
+              <w:spacing w:after="0" w:line="260"/>
+            </w:pPr>
+            <w:r>
+              <w:rPr>
+                <w:b w:val="false"/>
+                <w:bCs w:val="false"/>
+                <w:color w:val="2B2B2B"/>
+                <w:sz w:val="19"/>
+                <w:szCs w:val="19"/>
+              </w:rPr>
+              <w:t xml:space="preserve">Two kinds of node</w:t>
+            </w:r>
+          </w:p>
+        </w:tc>
+        <w:tc>
+          <w:tcPr>
+            <w:tcW w:type="dxa" w:w="6626"/>
+            <w:tcMar>
+              <w:top w:type="dxa" w:w="60"/>
+              <w:left w:type="dxa" w:w="120"/>
+              <w:bottom w:type="dxa" w:w="60"/>
+              <w:right w:type="dxa" w:w="120"/>
+            </w:tcMar>
+          </w:tcPr>
+          <w:p>
+            <w:pPr>
+              <w:spacing w:after="0" w:line="260"/>
+            </w:pPr>
+            <w:r>
+              <w:rPr>
+                <w:b w:val="false"/>
+                <w:bCs w:val="false"/>
+                <w:color w:val="2B2B2B"/>
+                <w:sz w:val="19"/>
+                <w:szCs w:val="19"/>
+              </w:rPr>
+              <w:t xml:space="preserve">A BLUE header with white arrow pins is a step — it goes in the execution line, in order. A GREEN header with an f and no arrows is a value — it never goes in the line; you place it to the side and wire across. Check the header colour before trying to drag an exec wire to something.</w:t>
+            </w:r>
+          </w:p>
+        </w:tc>
+      </w:tr>
+      <w:tr>
+        <w:trPr>
+          <w:tblHeader w:val="false"/>
+        </w:trPr>
+        <w:tc>
+          <w:tcPr>
+            <w:tcW w:type="dxa" w:w="2400"/>
+            <w:tcMar>
+              <w:top w:type="dxa" w:w="60"/>
+              <w:left w:type="dxa" w:w="120"/>
+              <w:bottom w:type="dxa" w:w="60"/>
+              <w:right w:type="dxa" w:w="120"/>
+            </w:tcMar>
+          </w:tcPr>
+          <w:p>
+            <w:pPr>
+              <w:spacing w:after="0" w:line="260"/>
+            </w:pPr>
+            <w:r>
+              <w:rPr>
+                <w:b w:val="false"/>
+                <w:bCs w:val="false"/>
+                <w:color w:val="2B2B2B"/>
+                <w:sz w:val="19"/>
+                <w:szCs w:val="19"/>
+              </w:rPr>
+              <w:t xml:space="preserve">Drag, don't right-click</w:t>
+            </w:r>
+          </w:p>
+        </w:tc>
+        <w:tc>
+          <w:tcPr>
+            <w:tcW w:type="dxa" w:w="6626"/>
+            <w:tcMar>
+              <w:top w:type="dxa" w:w="60"/>
+              <w:left w:type="dxa" w:w="120"/>
+              <w:bottom w:type="dxa" w:w="60"/>
+              <w:right w:type="dxa" w:w="120"/>
+            </w:tcMar>
+          </w:tcPr>
+          <w:p>
+            <w:pPr>
+              <w:spacing w:after="0" w:line="260"/>
+            </w:pPr>
+            <w:r>
+              <w:rPr>
+                <w:b w:val="false"/>
+                <w:bCs w:val="false"/>
+                <w:color w:val="2B2B2B"/>
+                <w:sz w:val="19"/>
+                <w:szCs w:val="19"/>
+              </w:rPr>
+              <w:t xml:space="preserve">RIGHT-CLICKING a pin gives you options about that pin (promote to variable, split it). DRAGGING off a pin and releasing gives you nodes that can connect to it, already wired. When you want a new node, drag.</w:t>
+            </w:r>
+          </w:p>
+        </w:tc>
+      </w:tr>
+      <w:tr>
+        <w:trPr>
+          <w:tblHeader w:val="false"/>
+        </w:trPr>
+        <w:tc>
+          <w:tcPr>
+            <w:tcW w:type="dxa" w:w="2400"/>
+            <w:tcMar>
+              <w:top w:type="dxa" w:w="60"/>
+              <w:left w:type="dxa" w:w="120"/>
+              <w:bottom w:type="dxa" w:w="60"/>
+              <w:right w:type="dxa" w:w="120"/>
+            </w:tcMar>
+          </w:tcPr>
+          <w:p>
+            <w:pPr>
+              <w:spacing w:after="0" w:line="260"/>
+            </w:pPr>
+            <w:r>
+              <w:rPr>
+                <w:b w:val="false"/>
+                <w:bCs w:val="false"/>
+                <w:color w:val="2B2B2B"/>
+                <w:sz w:val="19"/>
+                <w:szCs w:val="19"/>
+              </w:rPr>
+              <w:t xml:space="preserve">Arithmetic lives under Utilities</w:t>
+            </w:r>
+          </w:p>
+        </w:tc>
+        <w:tc>
+          <w:tcPr>
+            <w:tcW w:type="dxa" w:w="6626"/>
+            <w:tcMar>
+              <w:top w:type="dxa" w:w="60"/>
+              <w:left w:type="dxa" w:w="120"/>
+              <w:bottom w:type="dxa" w:w="60"/>
+              <w:right w:type="dxa" w:w="120"/>
+            </w:tcMar>
+          </w:tcPr>
+          <w:p>
+            <w:pPr>
+              <w:spacing w:after="0" w:line="260"/>
+            </w:pPr>
+            <w:r>
+              <w:rPr>
+                <w:b w:val="false"/>
+                <w:bCs w:val="false"/>
+                <w:color w:val="2B2B2B"/>
+                <w:sz w:val="19"/>
+                <w:szCs w:val="19"/>
+              </w:rPr>
+              <w:t xml:space="preserve">Add, Subtract, Multiply and Divide are filed under Utilities → Operators, not Math. Everyone looks in Math first.</w:t>
+            </w:r>
+          </w:p>
+        </w:tc>
+      </w:tr>
+      <w:tr>
+        <w:trPr>
+          <w:tblHeader w:val="false"/>
+        </w:trPr>
+        <w:tc>
+          <w:tcPr>
+            <w:tcW w:type="dxa" w:w="2400"/>
+            <w:tcMar>
+              <w:top w:type="dxa" w:w="60"/>
+              <w:left w:type="dxa" w:w="120"/>
+              <w:bottom w:type="dxa" w:w="60"/>
+              <w:right w:type="dxa" w:w="120"/>
+            </w:tcMar>
+          </w:tcPr>
+          <w:p>
+            <w:pPr>
+              <w:spacing w:after="0" w:line="260"/>
+            </w:pPr>
+            <w:r>
+              <w:rPr>
+                <w:b w:val="false"/>
+                <w:bCs w:val="false"/>
+                <w:color w:val="2B2B2B"/>
+                <w:sz w:val="19"/>
+                <w:szCs w:val="19"/>
+              </w:rPr>
+              <w:t xml:space="preserve">Unreal fails silently</w:t>
+            </w:r>
+          </w:p>
+        </w:tc>
+        <w:tc>
+          <w:tcPr>
+            <w:tcW w:type="dxa" w:w="6626"/>
+            <w:tcMar>
+              <w:top w:type="dxa" w:w="60"/>
+              <w:left w:type="dxa" w:w="120"/>
+              <w:bottom w:type="dxa" w:w="60"/>
+              <w:right w:type="dxa" w:w="120"/>
+            </w:tcMar>
+          </w:tcPr>
+          <w:p>
+            <w:pPr>
+              <w:spacing w:after="0" w:line="260"/>
+            </w:pPr>
+            <w:r>
+              <w:rPr>
+                <w:b w:val="false"/>
+                <w:bCs w:val="false"/>
+                <w:color w:val="2B2B2B"/>
+                <w:sz w:val="19"/>
+                <w:szCs w:val="19"/>
+              </w:rPr>
+              <w:t xml:space="preserve">Most mistakes here produce no error at all — the graph looks perfect and nothing happens. An unwired pin, a missing checkbox, a collision channel set to Ignore. When something does not work, suspect a setting outside the graph before you suspect the graph.</w:t>
+            </w:r>
+          </w:p>
+        </w:tc>
+      </w:tr>
+      <w:tr>
+        <w:trPr>
+          <w:tblHeader w:val="false"/>
+        </w:trPr>
+        <w:tc>
+          <w:tcPr>
+            <w:tcW w:type="dxa" w:w="2400"/>
+            <w:tcMar>
+              <w:top w:type="dxa" w:w="60"/>
+              <w:left w:type="dxa" w:w="120"/>
+              <w:bottom w:type="dxa" w:w="60"/>
+              <w:right w:type="dxa" w:w="120"/>
+            </w:tcMar>
+          </w:tcPr>
+          <w:p>
+            <w:pPr>
+              <w:spacing w:after="0" w:line="260"/>
+            </w:pPr>
+            <w:r>
+              <w:rPr>
+                <w:b w:val="false"/>
+                <w:bCs w:val="false"/>
+                <w:color w:val="2B2B2B"/>
+                <w:sz w:val="19"/>
+                <w:szCs w:val="19"/>
+              </w:rPr>
+              <w:t xml:space="preserve">Compile, then save</w:t>
+            </w:r>
+          </w:p>
+        </w:tc>
+        <w:tc>
+          <w:tcPr>
+            <w:tcW w:type="dxa" w:w="6626"/>
+            <w:tcMar>
+              <w:top w:type="dxa" w:w="60"/>
+              <w:left w:type="dxa" w:w="120"/>
+              <w:bottom w:type="dxa" w:w="60"/>
+              <w:right w:type="dxa" w:w="120"/>
+            </w:tcMar>
+          </w:tcPr>
+          <w:p>
+            <w:pPr>
+              <w:spacing w:after="0" w:line="260"/>
+            </w:pPr>
+            <w:r>
+              <w:rPr>
+                <w:b w:val="false"/>
+                <w:bCs w:val="false"/>
+                <w:color w:val="2B2B2B"/>
+                <w:sz w:val="19"/>
+                <w:szCs w:val="19"/>
+              </w:rPr>
+              <w:t xml:space="preserve">Compile turns your graph into something the game runs; Ctrl+S writes it to disk. Variable default values do not even appear until you have compiled once. Ctrl+Shift+S (Save All) after every step — Unreal keeps a surprising amount in memory and only writes on save.</w:t>
+            </w:r>
+          </w:p>
+        </w:tc>
+      </w:tr>
+    </w:tbl>
+    <w:p>
+      <w:pPr>
         <w:pStyle w:val="Heading1"/>
         <w:pageBreakBefore/>
       </w:pPr>
@@ -2335,6 +2710,19 @@
       </w:pPr>
       <w:r>
         <w:t xml:space="preserve">Look in the Outliner for PlayerStart. If it is not there, + Add → Basic → Player Start. Set its Location to 0, 0, 100 so it sits just above the floor rather than buried in it.</w:t>
+      </w:r>
+    </w:p>
+    <w:p>
+      <w:pPr>
+        <w:pStyle w:val="ListParagraph"/>
+        <w:numPr>
+          <w:ilvl w:val="0"/>
+          <w:numId w:val="3"/>
+        </w:numPr>
+        <w:spacing w:after="90" w:line="276"/>
+      </w:pPr>
+      <w:r>
+        <w:t xml:space="preserve">In the Content Browser, right-click in the empty space under Content → New Folder → name it GunsmokeMines. Everything you build goes in there, flat — no subfolders. It keeps your work separate from Epic's template content, and moving assets later leaves redirectors behind.</w:t>
       </w:r>
     </w:p>
     <w:p>
@@ -3393,7 +3781,7 @@
         <w:spacing w:after="90" w:line="276"/>
       </w:pPr>
       <w:r>
-        <w:t xml:space="preserve">Add a Static Mesh component as a child of the capsule. Assign SM_Cylinder from Content/LevelPrototyping/Meshes, set its Z to -88, and set Collision Presets to NoCollision.</w:t>
+        <w:t xml:space="preserve">Add a Static Mesh component as a child of the capsule. Assign SM_Cylinder from Content/LevelPrototyping/Meshes. Set its LOCATION Z to -88 — the Location row, third box, NOT Scale. Then set Collision Presets to NoCollision (use the Details panel search box to find it).</w:t>
       </w:r>
     </w:p>
     <w:p>
@@ -3406,7 +3794,7 @@
         <w:spacing w:after="90" w:line="276"/>
       </w:pPr>
       <w:r>
-        <w:t xml:space="preserve">Add a Spring Arm: Target Arm Length 1200, Rotation Pitch -60. Untick Do Collision Test, untick Inherit Pitch, Inherit Yaw and Inherit Roll. Tick Enable Camera Lag.</w:t>
+        <w:t xml:space="preserve">Add a Spring Arm: Target Arm Length 1200, and type -60 into the MIDDLE box of the Rotation row. The three boxes are Roll, Pitch, Yaw — pitch is the middle one. Untick Do Collision Test, untick Inherit Pitch, Inherit Yaw and Inherit Roll. Tick Enable Camera Lag.</w:t>
       </w:r>
     </w:p>
     <w:p>
@@ -3530,7 +3918,7 @@
         <w:spacing w:after="140" w:line="276"/>
       </w:pPr>
       <w:r>
-        <w:t xml:space="preserve">Open BP_Player and go to the Event Graph. First, turn the controls on:</w:t>
+        <w:t xml:space="preserve">Open BP_Player and go to the Event Graph. First, register the mapping context — until this runs, the Input Actions you made in 1.3 are just files on disk and no key does anything:</w:t>
       </w:r>
     </w:p>
     <w:tbl>
@@ -3803,7 +4191,23 @@
                 <w:sz w:val="17"/>
                 <w:szCs w:val="17"/>
               </w:rPr>
-              <w:t xml:space="preserve">  → Break Vector 2D [from the Action Value pin]</w:t>
+              <w:t xml:space="preserve">  → Break Vector 2D   (DRAG from the Action Value pin to get this.</w:t>
+            </w:r>
+          </w:p>
+          <w:p>
+            <w:pPr>
+              <w:spacing w:after="0" w:line="240"/>
+            </w:pPr>
+            <w:r>
+              <w:rPr>
+                <w:rFonts w:ascii="Consolas" w:cs="Consolas" w:eastAsia="Consolas" w:hAnsi="Consolas"/>
+                <w:b w:val="false"/>
+                <w:bCs w:val="false"/>
+                <w:color w:val="2B2B2B"/>
+                <w:sz w:val="17"/>
+                <w:szCs w:val="17"/>
+              </w:rPr>
+              <w:t xml:space="preserve">        Action Value cannot be Split Struct Pin — special type.)</w:t>
             </w:r>
           </w:p>
           <w:p>
@@ -3847,6 +4251,14 @@
       </w:pPr>
       <w:r>
         <w:t xml:space="preserve">1.6 Aim at the mouse</w:t>
+      </w:r>
+    </w:p>
+    <w:p>
+      <w:pPr>
+        <w:spacing w:after="140" w:line="276"/>
+      </w:pPr>
+      <w:r>
+        <w:t xml:space="preserve">Only TWO nodes here sit on the execution line. Everything else is a pure node hanging off to the side, feeding values in.</w:t>
       </w:r>
     </w:p>
     <w:tbl>
@@ -3921,349 +4333,295 @@
                 <w:sz w:val="17"/>
                 <w:szCs w:val="17"/>
               </w:rPr>
-              <w:t xml:space="preserve">Event Tick</w:t>
-            </w:r>
-          </w:p>
-          <w:p>
-            <w:pPr>
-              <w:spacing w:after="0" w:line="240"/>
-            </w:pPr>
-            <w:r>
-              <w:rPr>
-                <w:rFonts w:ascii="Consolas" w:cs="Consolas" w:eastAsia="Consolas" w:hAnsi="Consolas"/>
-                <w:b w:val="false"/>
-                <w:bCs w:val="false"/>
-                <w:color w:val="2B2B2B"/>
-                <w:sz w:val="17"/>
-                <w:szCs w:val="17"/>
-              </w:rPr>
-              <w:t xml:space="preserve">  → Get Player Controller [Player Index = 0]</w:t>
-            </w:r>
-          </w:p>
-          <w:p>
-            <w:pPr>
-              <w:spacing w:after="0" w:line="240"/>
-            </w:pPr>
-            <w:r>
-              <w:rPr>
-                <w:rFonts w:ascii="Consolas" w:cs="Consolas" w:eastAsia="Consolas" w:hAnsi="Consolas"/>
-                <w:b w:val="false"/>
-                <w:bCs w:val="false"/>
-                <w:color w:val="2B2B2B"/>
-                <w:sz w:val="17"/>
-                <w:szCs w:val="17"/>
-              </w:rPr>
-              <w:t xml:space="preserve">  → Get Hit Result Under Cursor by Channel [Trace Channel = Visibility]</w:t>
-            </w:r>
-          </w:p>
-          <w:p>
-            <w:pPr>
-              <w:spacing w:after="0" w:line="240"/>
-            </w:pPr>
-            <w:r>
-              <w:rPr>
-                <w:rFonts w:ascii="Consolas" w:cs="Consolas" w:eastAsia="Consolas" w:hAnsi="Consolas"/>
-                <w:b w:val="false"/>
-                <w:bCs w:val="false"/>
-                <w:color w:val="2B2B2B"/>
-                <w:sz w:val="17"/>
-                <w:szCs w:val="17"/>
-              </w:rPr>
-              <w:t xml:space="preserve">  → Break Hit Result → Location</w:t>
-            </w:r>
-          </w:p>
-          <w:p>
-            <w:pPr>
-              <w:spacing w:after="0" w:line="240"/>
-            </w:pPr>
-            <w:r>
-              <w:rPr>
-                <w:rFonts w:ascii="Consolas" w:cs="Consolas" w:eastAsia="Consolas" w:hAnsi="Consolas"/>
-                <w:b w:val="false"/>
-                <w:bCs w:val="false"/>
-                <w:color w:val="2B2B2B"/>
-                <w:sz w:val="17"/>
-                <w:szCs w:val="17"/>
-              </w:rPr>
-              <w:t xml:space="preserve">  → Find Look at Rotation [Start = Get Actor Location, Target = Location]</w:t>
-            </w:r>
-          </w:p>
-          <w:p>
-            <w:pPr>
-              <w:spacing w:after="0" w:line="240"/>
-            </w:pPr>
-            <w:r>
-              <w:rPr>
-                <w:rFonts w:ascii="Consolas" w:cs="Consolas" w:eastAsia="Consolas" w:hAnsi="Consolas"/>
-                <w:b w:val="false"/>
-                <w:bCs w:val="false"/>
-                <w:color w:val="2B2B2B"/>
-                <w:sz w:val="17"/>
-                <w:szCs w:val="17"/>
-              </w:rPr>
-              <w:t xml:space="preserve">  → Break Rotator   (you only want Z, the Yaw)</w:t>
-            </w:r>
-          </w:p>
-          <w:p>
-            <w:pPr>
-              <w:spacing w:after="0" w:line="240"/>
-            </w:pPr>
-            <w:r>
-              <w:rPr>
-                <w:rFonts w:ascii="Consolas" w:cs="Consolas" w:eastAsia="Consolas" w:hAnsi="Consolas"/>
-                <w:b w:val="false"/>
-                <w:bCs w:val="false"/>
-                <w:color w:val="2B2B2B"/>
-                <w:sz w:val="17"/>
-                <w:szCs w:val="17"/>
-              </w:rPr>
-              <w:t xml:space="preserve">  → Make Rotator [Roll = 0, Pitch = 0, Yaw = the Z you just broke out]</w:t>
-            </w:r>
-          </w:p>
-          <w:p>
-            <w:pPr>
-              <w:spacing w:after="0" w:line="240"/>
-            </w:pPr>
-            <w:r>
-              <w:rPr>
-                <w:rFonts w:ascii="Consolas" w:cs="Consolas" w:eastAsia="Consolas" w:hAnsi="Consolas"/>
-                <w:b w:val="false"/>
-                <w:bCs w:val="false"/>
-                <w:color w:val="2B2B2B"/>
-                <w:sz w:val="17"/>
-                <w:szCs w:val="17"/>
-              </w:rPr>
-              <w:t xml:space="preserve">  → Set Actor Rotation</w:t>
-            </w:r>
-          </w:p>
-        </w:tc>
-      </w:tr>
-    </w:tbl>
-    <w:p>
-      <w:pPr>
-        <w:spacing w:after="140" w:line="276"/>
-      </w:pPr>
-      <w:r>
-        <w:t xml:space="preserve">Zeroing Roll and Pitch is what stops the character tipping over to point at the floor.</w:t>
-      </w:r>
-    </w:p>
-    <w:p>
-      <w:pPr>
-        <w:pStyle w:val="Heading2"/>
-      </w:pPr>
-      <w:r>
-        <w:t xml:space="preserve">1.7 Dash</w:t>
-      </w:r>
-    </w:p>
-    <w:p>
-      <w:pPr>
-        <w:spacing w:after="140" w:line="276"/>
-      </w:pPr>
-      <w:r>
-        <w:t xml:space="preserve">In the My Blueprint panel on the left, add four variables to BP_Player: DashSpeed (Float, default 1500), DashCooldown (Float, default 1.0), bCanDash (Boolean, default true — tick the box), bIsInvulnerable (Boolean).</w:t>
-      </w:r>
-    </w:p>
-    <w:tbl>
-      <w:tblPr>
-        <w:tblW w:type="dxa" w:w="9026"/>
-        <w:tblBorders>
-          <w:top w:val="single" w:color="D9CBB6" w:sz="4"/>
-          <w:left w:val="single" w:color="6E2A1F" w:sz="18"/>
-          <w:bottom w:val="single" w:color="D9CBB6" w:sz="4"/>
-          <w:right w:val="single" w:color="D9CBB6" w:sz="4"/>
-          <w:insideH w:val="single" w:color="auto" w:sz="4"/>
-          <w:insideV w:val="single" w:color="auto" w:sz="4"/>
-        </w:tblBorders>
-      </w:tblPr>
-      <w:tblGrid>
-        <w:gridCol w:w="9026"/>
-      </w:tblGrid>
-      <w:tr>
-        <w:tc>
-          <w:tcPr>
-            <w:tcW w:type="dxa" w:w="9026"/>
-            <w:shd w:fill="E8DFD0" w:color="auto" w:val="clear"/>
-            <w:tcMar>
-              <w:top w:type="dxa" w:w="50"/>
-              <w:left w:type="dxa" w:w="120"/>
-              <w:bottom w:type="dxa" w:w="50"/>
-              <w:right w:type="dxa" w:w="120"/>
-            </w:tcMar>
-          </w:tcPr>
-          <w:p>
-            <w:pPr>
-              <w:spacing w:after="0"/>
-            </w:pPr>
-            <w:r>
-              <w:rPr>
-                <w:b/>
-                <w:bCs/>
-                <w:color w:val="6E2A1F"/>
-                <w:sz w:val="15"/>
-                <w:szCs w:val="15"/>
-              </w:rPr>
-              <w:t xml:space="preserve">BLUEPRINT NODES — BP_Player, Event Graph</w:t>
-            </w:r>
-          </w:p>
-        </w:tc>
-      </w:tr>
-      <w:tr>
-        <w:trPr>
-          <w:cantSplit/>
-        </w:trPr>
-        <w:tc>
-          <w:tcPr>
-            <w:tcW w:type="dxa" w:w="9026"/>
-            <w:shd w:fill="F4F1EA" w:color="auto" w:val="clear"/>
-            <w:tcMar>
-              <w:top w:type="dxa" w:w="60"/>
-              <w:left w:type="dxa" w:w="120"/>
-              <w:bottom w:type="dxa" w:w="60"/>
-              <w:right w:type="dxa" w:w="120"/>
-            </w:tcMar>
-          </w:tcPr>
-          <w:p>
-            <w:pPr>
-              <w:spacing w:after="0" w:line="240"/>
-            </w:pPr>
-            <w:r>
-              <w:rPr>
-                <w:rFonts w:ascii="Consolas" w:cs="Consolas" w:eastAsia="Consolas" w:hAnsi="Consolas"/>
-                <w:b w:val="false"/>
-                <w:bCs w:val="false"/>
-                <w:color w:val="2B2B2B"/>
-                <w:sz w:val="17"/>
-                <w:szCs w:val="17"/>
-              </w:rPr>
-              <w:t xml:space="preserve">Input Action IA_Dash (Triggered)</w:t>
-            </w:r>
-          </w:p>
-          <w:p>
-            <w:pPr>
-              <w:spacing w:after="0" w:line="240"/>
-            </w:pPr>
-            <w:r>
-              <w:rPr>
-                <w:rFonts w:ascii="Consolas" w:cs="Consolas" w:eastAsia="Consolas" w:hAnsi="Consolas"/>
-                <w:b w:val="false"/>
-                <w:bCs w:val="false"/>
-                <w:color w:val="2B2B2B"/>
-                <w:sz w:val="17"/>
-                <w:szCs w:val="17"/>
-              </w:rPr>
-              <w:t xml:space="preserve">  → Branch [Condition = bCanDash]</w:t>
-            </w:r>
-          </w:p>
-          <w:p>
-            <w:pPr>
-              <w:spacing w:after="0" w:line="240"/>
-            </w:pPr>
-            <w:r>
-              <w:rPr>
-                <w:rFonts w:ascii="Consolas" w:cs="Consolas" w:eastAsia="Consolas" w:hAnsi="Consolas"/>
-                <w:b w:val="false"/>
-                <w:bCs w:val="false"/>
-                <w:color w:val="2B2B2B"/>
-                <w:sz w:val="17"/>
-                <w:szCs w:val="17"/>
-              </w:rPr>
-              <w:t xml:space="preserve">  → Set bCanDash = false</w:t>
-            </w:r>
-          </w:p>
-          <w:p>
-            <w:pPr>
-              <w:spacing w:after="0" w:line="240"/>
-            </w:pPr>
-            <w:r>
-              <w:rPr>
-                <w:rFonts w:ascii="Consolas" w:cs="Consolas" w:eastAsia="Consolas" w:hAnsi="Consolas"/>
-                <w:b w:val="false"/>
-                <w:bCs w:val="false"/>
-                <w:color w:val="2B2B2B"/>
-                <w:sz w:val="17"/>
-                <w:szCs w:val="17"/>
-              </w:rPr>
-              <w:t xml:space="preserve">  → Set bIsInvulnerable = true</w:t>
-            </w:r>
-          </w:p>
-          <w:p>
-            <w:pPr>
-              <w:spacing w:after="0" w:line="240"/>
-            </w:pPr>
-            <w:r>
-              <w:rPr>
-                <w:rFonts w:ascii="Consolas" w:cs="Consolas" w:eastAsia="Consolas" w:hAnsi="Consolas"/>
-                <w:b w:val="false"/>
-                <w:bCs w:val="false"/>
-                <w:color w:val="2B2B2B"/>
-                <w:sz w:val="17"/>
-                <w:szCs w:val="17"/>
-              </w:rPr>
-              <w:t xml:space="preserve">  → Launch Character</w:t>
-            </w:r>
-          </w:p>
-          <w:p>
-            <w:pPr>
-              <w:spacing w:after="0" w:line="240"/>
-            </w:pPr>
-            <w:r>
-              <w:rPr>
-                <w:rFonts w:ascii="Consolas" w:cs="Consolas" w:eastAsia="Consolas" w:hAnsi="Consolas"/>
-                <w:b w:val="false"/>
-                <w:bCs w:val="false"/>
-                <w:color w:val="2B2B2B"/>
-                <w:sz w:val="17"/>
-                <w:szCs w:val="17"/>
-              </w:rPr>
-              <w:t xml:space="preserve">        [Launch Velocity = Get Actor Forward Vector * DashSpeed,</w:t>
-            </w:r>
-          </w:p>
-          <w:p>
-            <w:pPr>
-              <w:spacing w:after="0" w:line="240"/>
-            </w:pPr>
-            <w:r>
-              <w:rPr>
-                <w:rFonts w:ascii="Consolas" w:cs="Consolas" w:eastAsia="Consolas" w:hAnsi="Consolas"/>
-                <w:b w:val="false"/>
-                <w:bCs w:val="false"/>
-                <w:color w:val="2B2B2B"/>
-                <w:sz w:val="17"/>
-                <w:szCs w:val="17"/>
-              </w:rPr>
-              <w:t xml:space="preserve">         XY Override = checked]</w:t>
-            </w:r>
-          </w:p>
-          <w:p>
-            <w:pPr>
-              <w:spacing w:after="0" w:line="240"/>
-            </w:pPr>
-            <w:r>
-              <w:rPr>
-                <w:rFonts w:ascii="Consolas" w:cs="Consolas" w:eastAsia="Consolas" w:hAnsi="Consolas"/>
-                <w:b w:val="false"/>
-                <w:bCs w:val="false"/>
-                <w:color w:val="2B2B2B"/>
-                <w:sz w:val="17"/>
-                <w:szCs w:val="17"/>
-              </w:rPr>
-              <w:t xml:space="preserve">  → Set Timer by Event [Time = 0.3]  → Set bIsInvulnerable = false</w:t>
-            </w:r>
-          </w:p>
-          <w:p>
-            <w:pPr>
-              <w:spacing w:after="0" w:line="240"/>
-            </w:pPr>
-            <w:r>
-              <w:rPr>
-                <w:rFonts w:ascii="Consolas" w:cs="Consolas" w:eastAsia="Consolas" w:hAnsi="Consolas"/>
-                <w:b w:val="false"/>
-                <w:bCs w:val="false"/>
-                <w:color w:val="2B2B2B"/>
-                <w:sz w:val="17"/>
-                <w:szCs w:val="17"/>
-              </w:rPr>
-              <w:t xml:space="preserve">  → Set Timer by Event [Time = DashCooldown] → Set bCanDash = true</w:t>
+              <w:t xml:space="preserve">EXECUTION LINE (white wires) — just these two:</w:t>
+            </w:r>
+          </w:p>
+          <w:p>
+            <w:pPr>
+              <w:spacing w:after="0" w:line="240"/>
+            </w:pPr>
+            <w:r>
+              <w:rPr>
+                <w:rFonts w:ascii="Consolas" w:cs="Consolas" w:eastAsia="Consolas" w:hAnsi="Consolas"/>
+                <w:b w:val="false"/>
+                <w:bCs w:val="false"/>
+                <w:color w:val="2B2B2B"/>
+                <w:sz w:val="17"/>
+                <w:szCs w:val="17"/>
+              </w:rPr>
+              <w:t xml:space="preserve"/>
+            </w:r>
+          </w:p>
+          <w:p>
+            <w:pPr>
+              <w:spacing w:after="0" w:line="240"/>
+            </w:pPr>
+            <w:r>
+              <w:rPr>
+                <w:rFonts w:ascii="Consolas" w:cs="Consolas" w:eastAsia="Consolas" w:hAnsi="Consolas"/>
+                <w:b w:val="false"/>
+                <w:bCs w:val="false"/>
+                <w:color w:val="2B2B2B"/>
+                <w:sz w:val="17"/>
+                <w:szCs w:val="17"/>
+              </w:rPr>
+              <w:t xml:space="preserve">Event Tick  →  Set Actor Rotation   [Target = self, leave it]</w:t>
+            </w:r>
+          </w:p>
+          <w:p>
+            <w:pPr>
+              <w:spacing w:after="0" w:line="240"/>
+            </w:pPr>
+            <w:r>
+              <w:rPr>
+                <w:rFonts w:ascii="Consolas" w:cs="Consolas" w:eastAsia="Consolas" w:hAnsi="Consolas"/>
+                <w:b w:val="false"/>
+                <w:bCs w:val="false"/>
+                <w:color w:val="2B2B2B"/>
+                <w:sz w:val="17"/>
+                <w:szCs w:val="17"/>
+              </w:rPr>
+              <w:t xml:space="preserve"/>
+            </w:r>
+          </w:p>
+          <w:p>
+            <w:pPr>
+              <w:spacing w:after="0" w:line="240"/>
+            </w:pPr>
+            <w:r>
+              <w:rPr>
+                <w:rFonts w:ascii="Consolas" w:cs="Consolas" w:eastAsia="Consolas" w:hAnsi="Consolas"/>
+                <w:b w:val="false"/>
+                <w:bCs w:val="false"/>
+                <w:color w:val="2B2B2B"/>
+                <w:sz w:val="17"/>
+                <w:szCs w:val="17"/>
+              </w:rPr>
+              <w:t xml:space="preserve"/>
+            </w:r>
+          </w:p>
+          <w:p>
+            <w:pPr>
+              <w:spacing w:after="0" w:line="240"/>
+            </w:pPr>
+            <w:r>
+              <w:rPr>
+                <w:rFonts w:ascii="Consolas" w:cs="Consolas" w:eastAsia="Consolas" w:hAnsi="Consolas"/>
+                <w:b w:val="false"/>
+                <w:bCs w:val="false"/>
+                <w:color w:val="2B2B2B"/>
+                <w:sz w:val="17"/>
+                <w:szCs w:val="17"/>
+              </w:rPr>
+              <w:t xml:space="preserve">VALUES (no white wires — place them to the side and wire across):</w:t>
+            </w:r>
+          </w:p>
+          <w:p>
+            <w:pPr>
+              <w:spacing w:after="0" w:line="240"/>
+            </w:pPr>
+            <w:r>
+              <w:rPr>
+                <w:rFonts w:ascii="Consolas" w:cs="Consolas" w:eastAsia="Consolas" w:hAnsi="Consolas"/>
+                <w:b w:val="false"/>
+                <w:bCs w:val="false"/>
+                <w:color w:val="2B2B2B"/>
+                <w:sz w:val="17"/>
+                <w:szCs w:val="17"/>
+              </w:rPr>
+              <w:t xml:space="preserve"/>
+            </w:r>
+          </w:p>
+          <w:p>
+            <w:pPr>
+              <w:spacing w:after="0" w:line="240"/>
+            </w:pPr>
+            <w:r>
+              <w:rPr>
+                <w:rFonts w:ascii="Consolas" w:cs="Consolas" w:eastAsia="Consolas" w:hAnsi="Consolas"/>
+                <w:b w:val="false"/>
+                <w:bCs w:val="false"/>
+                <w:color w:val="2B2B2B"/>
+                <w:sz w:val="17"/>
+                <w:szCs w:val="17"/>
+              </w:rPr>
+              <w:t xml:space="preserve">  Get Player Controller [Player Index = 0]</w:t>
+            </w:r>
+          </w:p>
+          <w:p>
+            <w:pPr>
+              <w:spacing w:after="0" w:line="240"/>
+            </w:pPr>
+            <w:r>
+              <w:rPr>
+                <w:rFonts w:ascii="Consolas" w:cs="Consolas" w:eastAsia="Consolas" w:hAnsi="Consolas"/>
+                <w:b w:val="false"/>
+                <w:bCs w:val="false"/>
+                <w:color w:val="2B2B2B"/>
+                <w:sz w:val="17"/>
+                <w:szCs w:val="17"/>
+              </w:rPr>
+              <w:t xml:space="preserve">       → Target of Get Hit Result Under Cursor by Channel</w:t>
+            </w:r>
+          </w:p>
+          <w:p>
+            <w:pPr>
+              <w:spacing w:after="0" w:line="240"/>
+            </w:pPr>
+            <w:r>
+              <w:rPr>
+                <w:rFonts w:ascii="Consolas" w:cs="Consolas" w:eastAsia="Consolas" w:hAnsi="Consolas"/>
+                <w:b w:val="false"/>
+                <w:bCs w:val="false"/>
+                <w:color w:val="2B2B2B"/>
+                <w:sz w:val="17"/>
+                <w:szCs w:val="17"/>
+              </w:rPr>
+              <w:t xml:space="preserve"/>
+            </w:r>
+          </w:p>
+          <w:p>
+            <w:pPr>
+              <w:spacing w:after="0" w:line="240"/>
+            </w:pPr>
+            <w:r>
+              <w:rPr>
+                <w:rFonts w:ascii="Consolas" w:cs="Consolas" w:eastAsia="Consolas" w:hAnsi="Consolas"/>
+                <w:b w:val="false"/>
+                <w:bCs w:val="false"/>
+                <w:color w:val="2B2B2B"/>
+                <w:sz w:val="17"/>
+                <w:szCs w:val="17"/>
+              </w:rPr>
+              <w:t xml:space="preserve">  Get Hit Result Under Cursor by Channel [Channel = Visibility]</w:t>
+            </w:r>
+          </w:p>
+          <w:p>
+            <w:pPr>
+              <w:spacing w:after="0" w:line="240"/>
+            </w:pPr>
+            <w:r>
+              <w:rPr>
+                <w:rFonts w:ascii="Consolas" w:cs="Consolas" w:eastAsia="Consolas" w:hAnsi="Consolas"/>
+                <w:b w:val="false"/>
+                <w:bCs w:val="false"/>
+                <w:color w:val="2B2B2B"/>
+                <w:sz w:val="17"/>
+                <w:szCs w:val="17"/>
+              </w:rPr>
+              <w:t xml:space="preserve">       → Out Hit → Break Hit Result → Location</w:t>
+            </w:r>
+          </w:p>
+          <w:p>
+            <w:pPr>
+              <w:spacing w:after="0" w:line="240"/>
+            </w:pPr>
+            <w:r>
+              <w:rPr>
+                <w:rFonts w:ascii="Consolas" w:cs="Consolas" w:eastAsia="Consolas" w:hAnsi="Consolas"/>
+                <w:b w:val="false"/>
+                <w:bCs w:val="false"/>
+                <w:color w:val="2B2B2B"/>
+                <w:sz w:val="17"/>
+                <w:szCs w:val="17"/>
+              </w:rPr>
+              <w:t xml:space="preserve"/>
+            </w:r>
+          </w:p>
+          <w:p>
+            <w:pPr>
+              <w:spacing w:after="0" w:line="240"/>
+            </w:pPr>
+            <w:r>
+              <w:rPr>
+                <w:rFonts w:ascii="Consolas" w:cs="Consolas" w:eastAsia="Consolas" w:hAnsi="Consolas"/>
+                <w:b w:val="false"/>
+                <w:bCs w:val="false"/>
+                <w:color w:val="2B2B2B"/>
+                <w:sz w:val="17"/>
+                <w:szCs w:val="17"/>
+              </w:rPr>
+              <w:t xml:space="preserve">  Get Actor Location  →  Start   of Find Look at Rotation</w:t>
+            </w:r>
+          </w:p>
+          <w:p>
+            <w:pPr>
+              <w:spacing w:after="0" w:line="240"/>
+            </w:pPr>
+            <w:r>
+              <w:rPr>
+                <w:rFonts w:ascii="Consolas" w:cs="Consolas" w:eastAsia="Consolas" w:hAnsi="Consolas"/>
+                <w:b w:val="false"/>
+                <w:bCs w:val="false"/>
+                <w:color w:val="2B2B2B"/>
+                <w:sz w:val="17"/>
+                <w:szCs w:val="17"/>
+              </w:rPr>
+              <w:t xml:space="preserve">  Location (above)    →  Target  of Find Look at Rotation</w:t>
+            </w:r>
+          </w:p>
+          <w:p>
+            <w:pPr>
+              <w:spacing w:after="0" w:line="240"/>
+            </w:pPr>
+            <w:r>
+              <w:rPr>
+                <w:rFonts w:ascii="Consolas" w:cs="Consolas" w:eastAsia="Consolas" w:hAnsi="Consolas"/>
+                <w:b w:val="false"/>
+                <w:bCs w:val="false"/>
+                <w:color w:val="2B2B2B"/>
+                <w:sz w:val="17"/>
+                <w:szCs w:val="17"/>
+              </w:rPr>
+              <w:t xml:space="preserve"/>
+            </w:r>
+          </w:p>
+          <w:p>
+            <w:pPr>
+              <w:spacing w:after="0" w:line="240"/>
+            </w:pPr>
+            <w:r>
+              <w:rPr>
+                <w:rFonts w:ascii="Consolas" w:cs="Consolas" w:eastAsia="Consolas" w:hAnsi="Consolas"/>
+                <w:b w:val="false"/>
+                <w:bCs w:val="false"/>
+                <w:color w:val="2B2B2B"/>
+                <w:sz w:val="17"/>
+                <w:szCs w:val="17"/>
+              </w:rPr>
+              <w:t xml:space="preserve">  Right-click Find Look at Rotation's Return Value → Split Struct Pin</w:t>
+            </w:r>
+          </w:p>
+          <w:p>
+            <w:pPr>
+              <w:spacing w:after="0" w:line="240"/>
+            </w:pPr>
+            <w:r>
+              <w:rPr>
+                <w:rFonts w:ascii="Consolas" w:cs="Consolas" w:eastAsia="Consolas" w:hAnsi="Consolas"/>
+                <w:b w:val="false"/>
+                <w:bCs w:val="false"/>
+                <w:color w:val="2B2B2B"/>
+                <w:sz w:val="17"/>
+                <w:szCs w:val="17"/>
+              </w:rPr>
+              <w:t xml:space="preserve">  Right-click Set Actor Rotation's New Rotation    → Split Struct Pin</w:t>
+            </w:r>
+          </w:p>
+          <w:p>
+            <w:pPr>
+              <w:spacing w:after="0" w:line="240"/>
+            </w:pPr>
+            <w:r>
+              <w:rPr>
+                <w:rFonts w:ascii="Consolas" w:cs="Consolas" w:eastAsia="Consolas" w:hAnsi="Consolas"/>
+                <w:b w:val="false"/>
+                <w:bCs w:val="false"/>
+                <w:color w:val="2B2B2B"/>
+                <w:sz w:val="17"/>
+                <w:szCs w:val="17"/>
+              </w:rPr>
+              <w:t xml:space="preserve">  Connect Z (Yaw) to Z (Yaw). Leave X and Y at 0.</w:t>
             </w:r>
           </w:p>
         </w:tc>
@@ -4311,6 +4669,284 @@
                 <w:sz w:val="18"/>
                 <w:szCs w:val="18"/>
               </w:rPr>
+              <w:t xml:space="preserve">Get Hit Result Under Cursor is a PURE node. </w:t>
+            </w:r>
+            <w:r>
+              <w:rPr>
+                <w:color w:val="2B2B2B"/>
+                <w:sz w:val="18"/>
+                <w:szCs w:val="18"/>
+              </w:rPr>
+              <w:t xml:space="preserve">Green header, no white arrows — you cannot put it in the execution line, and dragging from an exec pin will not find it. Right-click in empty space to place it. Zeroing Roll and Pitch is what stops the character tipping over to point at the floor when the cursor is near your feet.</w:t>
+            </w:r>
+          </w:p>
+        </w:tc>
+      </w:tr>
+    </w:tbl>
+    <w:p>
+      <w:pPr>
+        <w:pStyle w:val="Heading2"/>
+      </w:pPr>
+      <w:r>
+        <w:t xml:space="preserve">1.7 Dash</w:t>
+      </w:r>
+    </w:p>
+    <w:p>
+      <w:pPr>
+        <w:spacing w:after="140" w:line="276"/>
+      </w:pPr>
+      <w:r>
+        <w:t xml:space="preserve">In the My Blueprint panel on the left, add four variables to BP_Player: DashSpeed (Float, default 1500), DashCooldown (Float, default 1.0), bCanDash (Boolean, default true — tick the box), bIsInvulnerable (Boolean).</w:t>
+      </w:r>
+    </w:p>
+    <w:tbl>
+      <w:tblPr>
+        <w:tblW w:type="dxa" w:w="9026"/>
+        <w:tblBorders>
+          <w:top w:val="single" w:color="D9CBB6" w:sz="4"/>
+          <w:left w:val="single" w:color="6E2A1F" w:sz="18"/>
+          <w:bottom w:val="single" w:color="D9CBB6" w:sz="4"/>
+          <w:right w:val="single" w:color="D9CBB6" w:sz="4"/>
+          <w:insideH w:val="single" w:color="auto" w:sz="4"/>
+          <w:insideV w:val="single" w:color="auto" w:sz="4"/>
+        </w:tblBorders>
+      </w:tblPr>
+      <w:tblGrid>
+        <w:gridCol w:w="9026"/>
+      </w:tblGrid>
+      <w:tr>
+        <w:tc>
+          <w:tcPr>
+            <w:tcW w:type="dxa" w:w="9026"/>
+            <w:shd w:fill="E8DFD0" w:color="auto" w:val="clear"/>
+            <w:tcMar>
+              <w:top w:type="dxa" w:w="50"/>
+              <w:left w:type="dxa" w:w="120"/>
+              <w:bottom w:type="dxa" w:w="50"/>
+              <w:right w:type="dxa" w:w="120"/>
+            </w:tcMar>
+          </w:tcPr>
+          <w:p>
+            <w:pPr>
+              <w:spacing w:after="0"/>
+            </w:pPr>
+            <w:r>
+              <w:rPr>
+                <w:b/>
+                <w:bCs/>
+                <w:color w:val="6E2A1F"/>
+                <w:sz w:val="15"/>
+                <w:szCs w:val="15"/>
+              </w:rPr>
+              <w:t xml:space="preserve">BLUEPRINT NODES — BP_Player, Event Graph</w:t>
+            </w:r>
+          </w:p>
+        </w:tc>
+      </w:tr>
+      <w:tr>
+        <w:trPr>
+          <w:cantSplit/>
+        </w:trPr>
+        <w:tc>
+          <w:tcPr>
+            <w:tcW w:type="dxa" w:w="9026"/>
+            <w:shd w:fill="F4F1EA" w:color="auto" w:val="clear"/>
+            <w:tcMar>
+              <w:top w:type="dxa" w:w="60"/>
+              <w:left w:type="dxa" w:w="120"/>
+              <w:bottom w:type="dxa" w:w="60"/>
+              <w:right w:type="dxa" w:w="120"/>
+            </w:tcMar>
+          </w:tcPr>
+          <w:p>
+            <w:pPr>
+              <w:spacing w:after="0" w:line="240"/>
+            </w:pPr>
+            <w:r>
+              <w:rPr>
+                <w:rFonts w:ascii="Consolas" w:cs="Consolas" w:eastAsia="Consolas" w:hAnsi="Consolas"/>
+                <w:b w:val="false"/>
+                <w:bCs w:val="false"/>
+                <w:color w:val="2B2B2B"/>
+                <w:sz w:val="17"/>
+                <w:szCs w:val="17"/>
+              </w:rPr>
+              <w:t xml:space="preserve">Input Action IA_Dash (Triggered)</w:t>
+            </w:r>
+          </w:p>
+          <w:p>
+            <w:pPr>
+              <w:spacing w:after="0" w:line="240"/>
+            </w:pPr>
+            <w:r>
+              <w:rPr>
+                <w:rFonts w:ascii="Consolas" w:cs="Consolas" w:eastAsia="Consolas" w:hAnsi="Consolas"/>
+                <w:b w:val="false"/>
+                <w:bCs w:val="false"/>
+                <w:color w:val="2B2B2B"/>
+                <w:sz w:val="17"/>
+                <w:szCs w:val="17"/>
+              </w:rPr>
+              <w:t xml:space="preserve">  → Branch [Condition = bCanDash]</w:t>
+            </w:r>
+          </w:p>
+          <w:p>
+            <w:pPr>
+              <w:spacing w:after="0" w:line="240"/>
+            </w:pPr>
+            <w:r>
+              <w:rPr>
+                <w:rFonts w:ascii="Consolas" w:cs="Consolas" w:eastAsia="Consolas" w:hAnsi="Consolas"/>
+                <w:b w:val="false"/>
+                <w:bCs w:val="false"/>
+                <w:color w:val="2B2B2B"/>
+                <w:sz w:val="17"/>
+                <w:szCs w:val="17"/>
+              </w:rPr>
+              <w:t xml:space="preserve">  → Set bCanDash = false</w:t>
+            </w:r>
+          </w:p>
+          <w:p>
+            <w:pPr>
+              <w:spacing w:after="0" w:line="240"/>
+            </w:pPr>
+            <w:r>
+              <w:rPr>
+                <w:rFonts w:ascii="Consolas" w:cs="Consolas" w:eastAsia="Consolas" w:hAnsi="Consolas"/>
+                <w:b w:val="false"/>
+                <w:bCs w:val="false"/>
+                <w:color w:val="2B2B2B"/>
+                <w:sz w:val="17"/>
+                <w:szCs w:val="17"/>
+              </w:rPr>
+              <w:t xml:space="preserve">  → Set bIsInvulnerable = true</w:t>
+            </w:r>
+          </w:p>
+          <w:p>
+            <w:pPr>
+              <w:spacing w:after="0" w:line="240"/>
+            </w:pPr>
+            <w:r>
+              <w:rPr>
+                <w:rFonts w:ascii="Consolas" w:cs="Consolas" w:eastAsia="Consolas" w:hAnsi="Consolas"/>
+                <w:b w:val="false"/>
+                <w:bCs w:val="false"/>
+                <w:color w:val="2B2B2B"/>
+                <w:sz w:val="17"/>
+                <w:szCs w:val="17"/>
+              </w:rPr>
+              <w:t xml:space="preserve">  → Launch Character</w:t>
+            </w:r>
+          </w:p>
+          <w:p>
+            <w:pPr>
+              <w:spacing w:after="0" w:line="240"/>
+            </w:pPr>
+            <w:r>
+              <w:rPr>
+                <w:rFonts w:ascii="Consolas" w:cs="Consolas" w:eastAsia="Consolas" w:hAnsi="Consolas"/>
+                <w:b w:val="false"/>
+                <w:bCs w:val="false"/>
+                <w:color w:val="2B2B2B"/>
+                <w:sz w:val="17"/>
+                <w:szCs w:val="17"/>
+              </w:rPr>
+              <w:t xml:space="preserve">        [Launch Velocity = Get Actor Forward Vector * DashSpeed,</w:t>
+            </w:r>
+          </w:p>
+          <w:p>
+            <w:pPr>
+              <w:spacing w:after="0" w:line="240"/>
+            </w:pPr>
+            <w:r>
+              <w:rPr>
+                <w:rFonts w:ascii="Consolas" w:cs="Consolas" w:eastAsia="Consolas" w:hAnsi="Consolas"/>
+                <w:b w:val="false"/>
+                <w:bCs w:val="false"/>
+                <w:color w:val="2B2B2B"/>
+                <w:sz w:val="17"/>
+                <w:szCs w:val="17"/>
+              </w:rPr>
+              <w:t xml:space="preserve">         XY Override = checked]</w:t>
+            </w:r>
+          </w:p>
+          <w:p>
+            <w:pPr>
+              <w:spacing w:after="0" w:line="240"/>
+            </w:pPr>
+            <w:r>
+              <w:rPr>
+                <w:rFonts w:ascii="Consolas" w:cs="Consolas" w:eastAsia="Consolas" w:hAnsi="Consolas"/>
+                <w:b w:val="false"/>
+                <w:bCs w:val="false"/>
+                <w:color w:val="2B2B2B"/>
+                <w:sz w:val="17"/>
+                <w:szCs w:val="17"/>
+              </w:rPr>
+              <w:t xml:space="preserve">  → Set Timer by Event [Time = 0.3]  → Set bIsInvulnerable = false</w:t>
+            </w:r>
+          </w:p>
+          <w:p>
+            <w:pPr>
+              <w:spacing w:after="0" w:line="240"/>
+            </w:pPr>
+            <w:r>
+              <w:rPr>
+                <w:rFonts w:ascii="Consolas" w:cs="Consolas" w:eastAsia="Consolas" w:hAnsi="Consolas"/>
+                <w:b w:val="false"/>
+                <w:bCs w:val="false"/>
+                <w:color w:val="2B2B2B"/>
+                <w:sz w:val="17"/>
+                <w:szCs w:val="17"/>
+              </w:rPr>
+              <w:t xml:space="preserve">  → Set Timer by Event [Time = DashCooldown] → Set bCanDash = true</w:t>
+            </w:r>
+          </w:p>
+        </w:tc>
+      </w:tr>
+    </w:tbl>
+    <w:tbl>
+      <w:tblPr>
+        <w:tblW w:type="dxa" w:w="9026"/>
+        <w:tblBorders>
+          <w:top w:val="single" w:color="E2D5BE" w:sz="2"/>
+          <w:left w:val="single" w:color="B08A50" w:sz="12"/>
+          <w:bottom w:val="single" w:color="E2D5BE" w:sz="2"/>
+          <w:right w:val="single" w:color="E2D5BE" w:sz="2"/>
+          <w:insideH w:val="single" w:color="auto" w:sz="4"/>
+          <w:insideV w:val="single" w:color="auto" w:sz="4"/>
+        </w:tblBorders>
+      </w:tblPr>
+      <w:tblGrid>
+        <w:gridCol w:w="9026"/>
+      </w:tblGrid>
+      <w:tr>
+        <w:trPr>
+          <w:cantSplit/>
+        </w:trPr>
+        <w:tc>
+          <w:tcPr>
+            <w:tcW w:type="dxa" w:w="9026"/>
+            <w:shd w:fill="FBF6EC" w:color="auto" w:val="clear"/>
+            <w:tcMar>
+              <w:top w:type="dxa" w:w="80"/>
+              <w:left w:type="dxa" w:w="140"/>
+              <w:bottom w:type="dxa" w:w="80"/>
+              <w:right w:type="dxa" w:w="120"/>
+            </w:tcMar>
+          </w:tcPr>
+          <w:p>
+            <w:pPr>
+              <w:spacing w:after="0" w:line="260"/>
+            </w:pPr>
+            <w:r>
+              <w:rPr>
+                <w:b/>
+                <w:bCs/>
+                <w:color w:val="6E2A1F"/>
+                <w:sz w:val="18"/>
+                <w:szCs w:val="18"/>
+              </w:rPr>
               <w:t xml:space="preserve">Check your progress: </w:t>
             </w:r>
             <w:r>
@@ -4972,39 +5608,55 @@
                 <w:sz w:val="17"/>
                 <w:szCs w:val="17"/>
               </w:rPr>
-              <w:t xml:space="preserve">        [Start = Get Actor Location + (0, 0, 40),</w:t>
-            </w:r>
-          </w:p>
-          <w:p>
-            <w:pPr>
-              <w:spacing w:after="0" w:line="240"/>
-            </w:pPr>
-            <w:r>
-              <w:rPr>
-                <w:rFonts w:ascii="Consolas" w:cs="Consolas" w:eastAsia="Consolas" w:hAnsi="Consolas"/>
-                <w:b w:val="false"/>
-                <w:bCs w:val="false"/>
-                <w:color w:val="2B2B2B"/>
-                <w:sz w:val="17"/>
-                <w:szCs w:val="17"/>
-              </w:rPr>
-              <w:t xml:space="preserve">         End   = Start + (Get Actor Forward Vector * 1500),</w:t>
-            </w:r>
-          </w:p>
-          <w:p>
-            <w:pPr>
-              <w:spacing w:after="0" w:line="240"/>
-            </w:pPr>
-            <w:r>
-              <w:rPr>
-                <w:rFonts w:ascii="Consolas" w:cs="Consolas" w:eastAsia="Consolas" w:hAnsi="Consolas"/>
-                <w:b w:val="false"/>
-                <w:bCs w:val="false"/>
-                <w:color w:val="2B2B2B"/>
-                <w:sz w:val="17"/>
-                <w:szCs w:val="17"/>
-              </w:rPr>
-              <w:t xml:space="preserve">         Actors to Ignore = Self,</w:t>
+              <w:t xml:space="preserve">        [Start = Get Actor Location,</w:t>
+            </w:r>
+          </w:p>
+          <w:p>
+            <w:pPr>
+              <w:spacing w:after="0" w:line="240"/>
+            </w:pPr>
+            <w:r>
+              <w:rPr>
+                <w:rFonts w:ascii="Consolas" w:cs="Consolas" w:eastAsia="Consolas" w:hAnsi="Consolas"/>
+                <w:b w:val="false"/>
+                <w:bCs w:val="false"/>
+                <w:color w:val="2B2B2B"/>
+                <w:sz w:val="17"/>
+                <w:szCs w:val="17"/>
+              </w:rPr>
+              <w:t xml:space="preserve">         End   = Get Actor Location + (Get Actor Forward Vector * 1500),</w:t>
+            </w:r>
+          </w:p>
+          <w:p>
+            <w:pPr>
+              <w:spacing w:after="0" w:line="240"/>
+            </w:pPr>
+            <w:r>
+              <w:rPr>
+                <w:rFonts w:ascii="Consolas" w:cs="Consolas" w:eastAsia="Consolas" w:hAnsi="Consolas"/>
+                <w:b w:val="false"/>
+                <w:bCs w:val="false"/>
+                <w:color w:val="2B2B2B"/>
+                <w:sz w:val="17"/>
+                <w:szCs w:val="17"/>
+              </w:rPr>
+              <w:t xml:space="preserve">         Ignore Self = ticked  (a checkbox on the node — you do</w:t>
+            </w:r>
+          </w:p>
+          <w:p>
+            <w:pPr>
+              <w:spacing w:after="0" w:line="240"/>
+            </w:pPr>
+            <w:r>
+              <w:rPr>
+                <w:rFonts w:ascii="Consolas" w:cs="Consolas" w:eastAsia="Consolas" w:hAnsi="Consolas"/>
+                <w:b w:val="false"/>
+                <w:bCs w:val="false"/>
+                <w:color w:val="2B2B2B"/>
+                <w:sz w:val="17"/>
+                <w:szCs w:val="17"/>
+              </w:rPr>
+              <w:t xml:space="preserve">                                not need the Actors to Ignore array),</w:t>
             </w:r>
           </w:p>
           <w:p>
@@ -5052,71 +5704,135 @@
                 <w:sz w:val="17"/>
                 <w:szCs w:val="17"/>
               </w:rPr>
-              <w:t xml:space="preserve">  → (True) Break Hit Result → Hit Actor</w:t>
-            </w:r>
-          </w:p>
-          <w:p>
-            <w:pPr>
-              <w:spacing w:after="0" w:line="240"/>
-            </w:pPr>
-            <w:r>
-              <w:rPr>
-                <w:rFonts w:ascii="Consolas" w:cs="Consolas" w:eastAsia="Consolas" w:hAnsi="Consolas"/>
-                <w:b w:val="false"/>
-                <w:bCs w:val="false"/>
-                <w:color w:val="2B2B2B"/>
-                <w:sz w:val="17"/>
-                <w:szCs w:val="17"/>
-              </w:rPr>
-              <w:t xml:space="preserve">  → Get Component by Class [Component Class = BPC_Health]</w:t>
-            </w:r>
-          </w:p>
-          <w:p>
-            <w:pPr>
-              <w:spacing w:after="0" w:line="240"/>
-            </w:pPr>
-            <w:r>
-              <w:rPr>
-                <w:rFonts w:ascii="Consolas" w:cs="Consolas" w:eastAsia="Consolas" w:hAnsi="Consolas"/>
-                <w:b w:val="false"/>
-                <w:bCs w:val="false"/>
-                <w:color w:val="2B2B2B"/>
-                <w:sz w:val="17"/>
-                <w:szCs w:val="17"/>
-              </w:rPr>
-              <w:t xml:space="preserve">  → Is Valid</w:t>
-            </w:r>
-          </w:p>
-          <w:p>
-            <w:pPr>
-              <w:spacing w:after="0" w:line="240"/>
-            </w:pPr>
-            <w:r>
-              <w:rPr>
-                <w:rFonts w:ascii="Consolas" w:cs="Consolas" w:eastAsia="Consolas" w:hAnsi="Consolas"/>
-                <w:b w:val="false"/>
-                <w:bCs w:val="false"/>
-                <w:color w:val="2B2B2B"/>
-                <w:sz w:val="17"/>
-                <w:szCs w:val="17"/>
-              </w:rPr>
-              <w:t xml:space="preserve">  → ApplyDamage [Amount = Damage * DamageMultiplier]</w:t>
-            </w:r>
-          </w:p>
-          <w:p>
-            <w:pPr>
-              <w:spacing w:after="0" w:line="240"/>
-            </w:pPr>
-            <w:r>
-              <w:rPr>
-                <w:rFonts w:ascii="Consolas" w:cs="Consolas" w:eastAsia="Consolas" w:hAnsi="Consolas"/>
-                <w:b w:val="false"/>
-                <w:bCs w:val="false"/>
-                <w:color w:val="2B2B2B"/>
-                <w:sz w:val="17"/>
-                <w:szCs w:val="17"/>
-              </w:rPr>
-              <w:t xml:space="preserve">  → Set Timer by Event [Time = 0.8] → Set bCanFire = true</w:t>
+              <w:t xml:space="preserve"/>
+            </w:r>
+          </w:p>
+          <w:p>
+            <w:pPr>
+              <w:spacing w:after="0" w:line="240"/>
+            </w:pPr>
+            <w:r>
+              <w:rPr>
+                <w:rFonts w:ascii="Consolas" w:cs="Consolas" w:eastAsia="Consolas" w:hAnsi="Consolas"/>
+                <w:b w:val="false"/>
+                <w:bCs w:val="false"/>
+                <w:color w:val="2B2B2B"/>
+                <w:sz w:val="17"/>
+                <w:szCs w:val="17"/>
+              </w:rPr>
+              <w:t xml:space="preserve">  (True) → Is Valid  (the macro, has exec pins)</w:t>
+            </w:r>
+          </w:p>
+          <w:p>
+            <w:pPr>
+              <w:spacing w:after="0" w:line="240"/>
+            </w:pPr>
+            <w:r>
+              <w:rPr>
+                <w:rFonts w:ascii="Consolas" w:cs="Consolas" w:eastAsia="Consolas" w:hAnsi="Consolas"/>
+                <w:b w:val="false"/>
+                <w:bCs w:val="false"/>
+                <w:color w:val="2B2B2B"/>
+                <w:sz w:val="17"/>
+                <w:szCs w:val="17"/>
+              </w:rPr>
+              <w:t xml:space="preserve">         → ApplyDamage [Amount = Damage * DamageMultiplier]</w:t>
+            </w:r>
+          </w:p>
+          <w:p>
+            <w:pPr>
+              <w:spacing w:after="0" w:line="240"/>
+            </w:pPr>
+            <w:r>
+              <w:rPr>
+                <w:rFonts w:ascii="Consolas" w:cs="Consolas" w:eastAsia="Consolas" w:hAnsi="Consolas"/>
+                <w:b w:val="false"/>
+                <w:bCs w:val="false"/>
+                <w:color w:val="2B2B2B"/>
+                <w:sz w:val="17"/>
+                <w:szCs w:val="17"/>
+              </w:rPr>
+              <w:t xml:space="preserve">         → Delay [Duration = 0.8] → Set bCanFire = true</w:t>
+            </w:r>
+          </w:p>
+          <w:p>
+            <w:pPr>
+              <w:spacing w:after="0" w:line="240"/>
+            </w:pPr>
+            <w:r>
+              <w:rPr>
+                <w:rFonts w:ascii="Consolas" w:cs="Consolas" w:eastAsia="Consolas" w:hAnsi="Consolas"/>
+                <w:b w:val="false"/>
+                <w:bCs w:val="false"/>
+                <w:color w:val="2B2B2B"/>
+                <w:sz w:val="17"/>
+                <w:szCs w:val="17"/>
+              </w:rPr>
+              <w:t xml:space="preserve"/>
+            </w:r>
+          </w:p>
+          <w:p>
+            <w:pPr>
+              <w:spacing w:after="0" w:line="240"/>
+            </w:pPr>
+            <w:r>
+              <w:rPr>
+                <w:rFonts w:ascii="Consolas" w:cs="Consolas" w:eastAsia="Consolas" w:hAnsi="Consolas"/>
+                <w:b w:val="false"/>
+                <w:bCs w:val="false"/>
+                <w:color w:val="2B2B2B"/>
+                <w:sz w:val="17"/>
+                <w:szCs w:val="17"/>
+              </w:rPr>
+              <w:t xml:space="preserve">  Values feeding the above, off to the side:</w:t>
+            </w:r>
+          </w:p>
+          <w:p>
+            <w:pPr>
+              <w:spacing w:after="0" w:line="240"/>
+            </w:pPr>
+            <w:r>
+              <w:rPr>
+                <w:rFonts w:ascii="Consolas" w:cs="Consolas" w:eastAsia="Consolas" w:hAnsi="Consolas"/>
+                <w:b w:val="false"/>
+                <w:bCs w:val="false"/>
+                <w:color w:val="2B2B2B"/>
+                <w:sz w:val="17"/>
+                <w:szCs w:val="17"/>
+              </w:rPr>
+              <w:t xml:space="preserve">     Out Hit → Break Hit Result → Hit Actor</w:t>
+            </w:r>
+          </w:p>
+          <w:p>
+            <w:pPr>
+              <w:spacing w:after="0" w:line="240"/>
+            </w:pPr>
+            <w:r>
+              <w:rPr>
+                <w:rFonts w:ascii="Consolas" w:cs="Consolas" w:eastAsia="Consolas" w:hAnsi="Consolas"/>
+                <w:b w:val="false"/>
+                <w:bCs w:val="false"/>
+                <w:color w:val="2B2B2B"/>
+                <w:sz w:val="17"/>
+                <w:szCs w:val="17"/>
+              </w:rPr>
+              <w:t xml:space="preserve">             → Get Component by Class [Component Class = BPC_Health]</w:t>
+            </w:r>
+          </w:p>
+          <w:p>
+            <w:pPr>
+              <w:spacing w:after="0" w:line="240"/>
+            </w:pPr>
+            <w:r>
+              <w:rPr>
+                <w:rFonts w:ascii="Consolas" w:cs="Consolas" w:eastAsia="Consolas" w:hAnsi="Consolas"/>
+                <w:b w:val="false"/>
+                <w:bCs w:val="false"/>
+                <w:color w:val="2B2B2B"/>
+                <w:sz w:val="17"/>
+                <w:szCs w:val="17"/>
+              </w:rPr>
+              <w:t xml:space="preserve">             → feeds both Is Valid's Input Object and ApplyDamage's Target</w:t>
             </w:r>
           </w:p>
         </w:tc>
@@ -5164,7 +5880,7 @@
                 <w:sz w:val="18"/>
                 <w:szCs w:val="18"/>
               </w:rPr>
-              <w:t xml:space="preserve">Trace along the actor, not the camera. </w:t>
+              <w:t xml:space="preserve">Three routes, one cooldown. </w:t>
             </w:r>
             <w:r>
               <w:rPr>
@@ -5172,7 +5888,7 @@
                 <w:sz w:val="18"/>
                 <w:szCs w:val="18"/>
               </w:rPr>
-              <w:t xml:space="preserve">The camera looks down at -60 degrees, so tracing along camera-forward fires into the floor two metres ahead. Your character already faces the cursor, so its forward vector is the aim direction. Leave Draw Debug Type on For Duration while testing so you can see where each shot went.</w:t>
+              <w:t xml:space="preserve">The Delay must be reachable from all three outcomes: ApplyDamage (you hit something with health), Is Valid's Is Not Valid pin (you hit a wall), and the second Branch's False pin (you hit nothing). Blueprint allows several exec wires into one input pin. Miss any of them and bCanFire stays false after that outcome, so you can never fire again.</w:t>
             </w:r>
           </w:p>
         </w:tc>
@@ -5180,50 +5896,8 @@
     </w:tbl>
     <w:p>
       <w:pPr>
-        <w:pStyle w:val="Heading2"/>
-      </w:pPr>
-      <w:r>
-        <w:t xml:space="preserve">2.3 Navigation</w:t>
-      </w:r>
-    </w:p>
-    <w:p>
-      <w:pPr>
-        <w:pStyle w:val="ListParagraph"/>
-        <w:numPr>
-          <w:ilvl w:val="0"/>
-          <w:numId w:val="6"/>
-        </w:numPr>
-        <w:spacing w:after="90" w:line="276"/>
-      </w:pPr>
-      <w:r>
-        <w:t xml:space="preserve">In the level, open the Place Actors panel and drag in a Nav Mesh Bounds Volume.</w:t>
-      </w:r>
-    </w:p>
-    <w:p>
-      <w:pPr>
-        <w:pStyle w:val="ListParagraph"/>
-        <w:numPr>
-          <w:ilvl w:val="0"/>
-          <w:numId w:val="6"/>
-        </w:numPr>
-        <w:spacing w:after="90" w:line="276"/>
-      </w:pPr>
-      <w:r>
-        <w:t xml:space="preserve">Scale it so it covers the whole floor, with some height above and below.</w:t>
-      </w:r>
-    </w:p>
-    <w:p>
-      <w:pPr>
-        <w:pStyle w:val="ListParagraph"/>
-        <w:numPr>
-          <w:ilvl w:val="0"/>
-          <w:numId w:val="6"/>
-        </w:numPr>
-        <w:spacing w:after="90" w:line="276"/>
-      </w:pPr>
-      <w:r>
-        <w:t xml:space="preserve">Press P in the viewport. You should see a green overlay across the floor.</w:t>
-      </w:r>
+        <w:spacing w:after="120"/>
+      </w:pPr>
     </w:p>
     <w:tbl>
       <w:tblPr>
@@ -5267,6 +5941,165 @@
                 <w:sz w:val="18"/>
                 <w:szCs w:val="18"/>
               </w:rPr>
+              <w:t xml:space="preserve">Pawns ignore the Visibility channel. </w:t>
+            </w:r>
+            <w:r>
+              <w:rPr>
+                <w:color w:val="2B2B2B"/>
+                <w:sz w:val="18"/>
+                <w:szCs w:val="18"/>
+              </w:rPr>
+              <w:t xml:space="preserve">Unreal's default Pawn collision profile is set to Ignore for Visibility, so this trace passes straight through bandits as though they were not there — they take no damage and never die, with no error anywhere. Fix it on the enemy, not here: BP_Bandit → Capsule Component → Collision Presets → Custom → set Visibility to Block. Do the same for the Boss in 4.1.</w:t>
+            </w:r>
+          </w:p>
+        </w:tc>
+      </w:tr>
+    </w:tbl>
+    <w:tbl>
+      <w:tblPr>
+        <w:tblW w:type="dxa" w:w="9026"/>
+        <w:tblBorders>
+          <w:top w:val="single" w:color="E2D5BE" w:sz="2"/>
+          <w:left w:val="single" w:color="B08A50" w:sz="12"/>
+          <w:bottom w:val="single" w:color="E2D5BE" w:sz="2"/>
+          <w:right w:val="single" w:color="E2D5BE" w:sz="2"/>
+          <w:insideH w:val="single" w:color="auto" w:sz="4"/>
+          <w:insideV w:val="single" w:color="auto" w:sz="4"/>
+        </w:tblBorders>
+      </w:tblPr>
+      <w:tblGrid>
+        <w:gridCol w:w="9026"/>
+      </w:tblGrid>
+      <w:tr>
+        <w:trPr>
+          <w:cantSplit/>
+        </w:trPr>
+        <w:tc>
+          <w:tcPr>
+            <w:tcW w:type="dxa" w:w="9026"/>
+            <w:shd w:fill="FBF6EC" w:color="auto" w:val="clear"/>
+            <w:tcMar>
+              <w:top w:type="dxa" w:w="80"/>
+              <w:left w:type="dxa" w:w="140"/>
+              <w:bottom w:type="dxa" w:w="80"/>
+              <w:right w:type="dxa" w:w="120"/>
+            </w:tcMar>
+          </w:tcPr>
+          <w:p>
+            <w:pPr>
+              <w:spacing w:after="0" w:line="260"/>
+            </w:pPr>
+            <w:r>
+              <w:rPr>
+                <w:b/>
+                <w:bCs/>
+                <w:color w:val="6E2A1F"/>
+                <w:sz w:val="18"/>
+                <w:szCs w:val="18"/>
+              </w:rPr>
+              <w:t xml:space="preserve">Trace along the actor, not the camera. </w:t>
+            </w:r>
+            <w:r>
+              <w:rPr>
+                <w:color w:val="2B2B2B"/>
+                <w:sz w:val="18"/>
+                <w:szCs w:val="18"/>
+              </w:rPr>
+              <w:t xml:space="preserve">The camera looks down at -60 degrees, so tracing along camera-forward fires into the floor two metres ahead. Your character already faces the cursor, so its forward vector is the aim direction. Leave Draw Debug Type on For Duration while testing so you can see where each shot went.</w:t>
+            </w:r>
+          </w:p>
+        </w:tc>
+      </w:tr>
+    </w:tbl>
+    <w:p>
+      <w:pPr>
+        <w:pStyle w:val="Heading2"/>
+      </w:pPr>
+      <w:r>
+        <w:t xml:space="preserve">2.3 Navigation</w:t>
+      </w:r>
+    </w:p>
+    <w:p>
+      <w:pPr>
+        <w:pStyle w:val="ListParagraph"/>
+        <w:numPr>
+          <w:ilvl w:val="0"/>
+          <w:numId w:val="6"/>
+        </w:numPr>
+        <w:spacing w:after="90" w:line="276"/>
+      </w:pPr>
+      <w:r>
+        <w:t xml:space="preserve">In the level, open the Place Actors panel and drag in a Nav Mesh Bounds Volume.</w:t>
+      </w:r>
+    </w:p>
+    <w:p>
+      <w:pPr>
+        <w:pStyle w:val="ListParagraph"/>
+        <w:numPr>
+          <w:ilvl w:val="0"/>
+          <w:numId w:val="6"/>
+        </w:numPr>
+        <w:spacing w:after="90" w:line="276"/>
+      </w:pPr>
+      <w:r>
+        <w:t xml:space="preserve">Scale it so it covers the whole floor, with some height above and below.</w:t>
+      </w:r>
+    </w:p>
+    <w:p>
+      <w:pPr>
+        <w:pStyle w:val="ListParagraph"/>
+        <w:numPr>
+          <w:ilvl w:val="0"/>
+          <w:numId w:val="6"/>
+        </w:numPr>
+        <w:spacing w:after="90" w:line="276"/>
+      </w:pPr>
+      <w:r>
+        <w:t xml:space="preserve">Press P in the viewport. You should see a green overlay across the floor.</w:t>
+      </w:r>
+    </w:p>
+    <w:tbl>
+      <w:tblPr>
+        <w:tblW w:type="dxa" w:w="9026"/>
+        <w:tblBorders>
+          <w:top w:val="single" w:color="E2D5BE" w:sz="2"/>
+          <w:left w:val="single" w:color="B08A50" w:sz="12"/>
+          <w:bottom w:val="single" w:color="E2D5BE" w:sz="2"/>
+          <w:right w:val="single" w:color="E2D5BE" w:sz="2"/>
+          <w:insideH w:val="single" w:color="auto" w:sz="4"/>
+          <w:insideV w:val="single" w:color="auto" w:sz="4"/>
+        </w:tblBorders>
+      </w:tblPr>
+      <w:tblGrid>
+        <w:gridCol w:w="9026"/>
+      </w:tblGrid>
+      <w:tr>
+        <w:trPr>
+          <w:cantSplit/>
+        </w:trPr>
+        <w:tc>
+          <w:tcPr>
+            <w:tcW w:type="dxa" w:w="9026"/>
+            <w:shd w:fill="FBF6EC" w:color="auto" w:val="clear"/>
+            <w:tcMar>
+              <w:top w:type="dxa" w:w="80"/>
+              <w:left w:type="dxa" w:w="140"/>
+              <w:bottom w:type="dxa" w:w="80"/>
+              <w:right w:type="dxa" w:w="120"/>
+            </w:tcMar>
+          </w:tcPr>
+          <w:p>
+            <w:pPr>
+              <w:spacing w:after="0" w:line="260"/>
+            </w:pPr>
+            <w:r>
+              <w:rPr>
+                <w:b/>
+                <w:bCs/>
+                <w:color w:val="6E2A1F"/>
+                <w:sz w:val="18"/>
+                <w:szCs w:val="18"/>
+              </w:rPr>
               <w:t xml:space="preserve">No green, no AI. </w:t>
             </w:r>
             <w:r>
@@ -5300,6 +6133,19 @@
       </w:pPr>
       <w:r>
         <w:t xml:space="preserve">Blueprint Class → Character. Name it BP_Bandit. Set up the capsule and placeholder mesh the same way as the player (1.4, steps 2 and 3).</w:t>
+      </w:r>
+    </w:p>
+    <w:p>
+      <w:pPr>
+        <w:pStyle w:val="ListParagraph"/>
+        <w:numPr>
+          <w:ilvl w:val="0"/>
+          <w:numId w:val="7"/>
+        </w:numPr>
+        <w:spacing w:after="90" w:line="276"/>
+      </w:pPr>
+      <w:r>
+        <w:t xml:space="preserve">Select the Capsule Component → Collision Presets → Custom → set the Visibility response to Block. Without this your shots pass straight through the bandit and it can never be killed.</w:t>
       </w:r>
     </w:p>
     <w:p>
@@ -5608,6 +6454,22 @@
                 <w:sz w:val="17"/>
                 <w:szCs w:val="17"/>
               </w:rPr>
+              <w:t xml:space="preserve">        (place ONE of these — its Return Value feeds BOTH range checks)</w:t>
+            </w:r>
+          </w:p>
+          <w:p>
+            <w:pPr>
+              <w:spacing w:after="0" w:line="240"/>
+            </w:pPr>
+            <w:r>
+              <w:rPr>
+                <w:rFonts w:ascii="Consolas" w:cs="Consolas" w:eastAsia="Consolas" w:hAnsi="Consolas"/>
+                <w:b w:val="false"/>
+                <w:bCs w:val="false"/>
+                <w:color w:val="2B2B2B"/>
+                <w:sz w:val="17"/>
+                <w:szCs w:val="17"/>
+              </w:rPr>
               <w:t xml:space="preserve"/>
             </w:r>
           </w:p>
@@ -5800,7 +6662,7 @@
                 <w:sz w:val="17"/>
                 <w:szCs w:val="17"/>
               </w:rPr>
-              <w:t xml:space="preserve">        → Set Timer by Event [Time = 1.5] → Set bCanAttack = true</w:t>
+              <w:t xml:space="preserve">        → Delay [Duration = 1.5] → Set bCanAttack = true</w:t>
             </w:r>
           </w:p>
           <w:p>
@@ -5897,6 +6759,38 @@
                 <w:szCs w:val="17"/>
               </w:rPr>
               <w:t xml:space="preserve">               Acceptable Radius = 150]</w:t>
+            </w:r>
+          </w:p>
+          <w:p>
+            <w:pPr>
+              <w:spacing w:after="0" w:line="240"/>
+            </w:pPr>
+            <w:r>
+              <w:rPr>
+                <w:rFonts w:ascii="Consolas" w:cs="Consolas" w:eastAsia="Consolas" w:hAnsi="Consolas"/>
+                <w:b w:val="false"/>
+                <w:bCs w:val="false"/>
+                <w:color w:val="2B2B2B"/>
+                <w:sz w:val="17"/>
+                <w:szCs w:val="17"/>
+              </w:rPr>
+              <w:t xml:space="preserve">        (Pawn does NOT default to self. Right-click empty space,</w:t>
+            </w:r>
+          </w:p>
+          <w:p>
+            <w:pPr>
+              <w:spacing w:after="0" w:line="240"/>
+            </w:pPr>
+            <w:r>
+              <w:rPr>
+                <w:rFonts w:ascii="Consolas" w:cs="Consolas" w:eastAsia="Consolas" w:hAnsi="Consolas"/>
+                <w:b w:val="false"/>
+                <w:bCs w:val="false"/>
+                <w:color w:val="2B2B2B"/>
+                <w:sz w:val="17"/>
+                <w:szCs w:val="17"/>
+              </w:rPr>
+              <w:t xml:space="preserve">         place a Self reference, and wire it into the Pawn pin.)</w:t>
             </w:r>
           </w:p>
         </w:tc>
@@ -6046,7 +6940,7 @@
                 <w:sz w:val="18"/>
                 <w:szCs w:val="18"/>
               </w:rPr>
-              <w:t xml:space="preserve">drag three bandits into the level and press Play. They should walk at you, hit you when they arrive, and disappear when you shoot them enough. Dash through an attack and confirm you take no damage. If you are running behind, this is the block worth borrowing time for — everything after it is quicker.</w:t>
+              <w:t xml:space="preserve">drag three bandits into the level and press Play. They should walk at you, hit you when they arrive, and die in ONE shot — Damage is 50 and their MaxHealth is 40. If you want them to take two or three hits, raise MaxHealth to 100 or drop Damage to 25. Dash through an attack and confirm you take no damage. If you are running behind, this is the block worth borrowing time for — everything after it is quicker.</w:t>
             </w:r>
           </w:p>
         </w:tc>

</xml_diff>

<commit_message>
Build plan 3.4: store LastCheckpoint as a Vector, not a Transform
A Transform carries scale, so respawning at a scaled checkpoint would
resize the player. Rotation is irrelevant since Event Tick aims the
character at the cursor every frame. Matches what is actually built.

Co-Authored-By: Claude Opus 5 <noreply@anthropic.com>
</commit_message>
<xml_diff>
--- a/Docs/Gunsmoke Mines - 2-Day Build Plan.docx
+++ b/Docs/Gunsmoke Mines - 2-Day Build Plan.docx
@@ -7041,7 +7041,7 @@
         <w:spacing w:after="140" w:line="276"/>
       </w:pPr>
       <w:r>
-        <w:t xml:space="preserve">Add two variables to BP_Player now: KeyCount (Integer) and LastCheckpoint (Transform).</w:t>
+        <w:t xml:space="preserve">Add two variables to BP_Player now: KeyCount (Integer) and LastCheckpoint (Vector — not Transform, a Transform carries scale and would resize you on respawn).</w:t>
       </w:r>
     </w:p>
     <w:p>
@@ -7841,7 +7841,7 @@
                 <w:sz w:val="17"/>
                 <w:szCs w:val="17"/>
               </w:rPr>
-              <w:t xml:space="preserve">  → Set the player's LastCheckpoint = Get Actor Transform</w:t>
+              <w:t xml:space="preserve">  → Set the player's LastCheckpoint = Get Actor Location</w:t>
             </w:r>
           </w:p>
           <w:p>
@@ -7991,7 +7991,7 @@
                 <w:sz w:val="17"/>
                 <w:szCs w:val="17"/>
               </w:rPr>
-              <w:t xml:space="preserve">  → Set LastCheckpoint = Get Actor Transform</w:t>
+              <w:t xml:space="preserve">  → Set LastCheckpoint = Get Actor Location</w:t>
             </w:r>
           </w:p>
           <w:p>
@@ -8149,7 +8149,7 @@
                 <w:sz w:val="17"/>
                 <w:szCs w:val="17"/>
               </w:rPr>
-              <w:t xml:space="preserve">        [New Location and New Rotation taken from LastCheckpoint,</w:t>
+              <w:t xml:space="preserve">        [New Location = LastCheckpoint + (0, 0, 100),</w:t>
             </w:r>
           </w:p>
           <w:p>
@@ -8221,7 +8221,7 @@
                 <w:sz w:val="18"/>
                 <w:szCs w:val="18"/>
               </w:rPr>
-              <w:t xml:space="preserve">Without setting LastCheckpoint at the start, dying before you reach a checkpoint reads an empty Transform and drops you at the world origin — usually under the floor, which looks exactly like a broken respawn.</w:t>
+              <w:t xml:space="preserve">Without setting LastCheckpoint at the start, dying before you reach a checkpoint reads an empty Vector and drops you at the world origin — usually under the floor, which looks exactly like a broken respawn.</w:t>
             </w:r>
           </w:p>
         </w:tc>

</xml_diff>